<commit_message>
Refactor to OOP to be in the exact requirements for the Python course work for university: replace procedural scripts with EmailProcessor class
</commit_message>
<xml_diff>
--- a/Техническа документация и практическо ръководство.docx
+++ b/Техническа документация и практическо ръководство.docx
@@ -249,7 +249,7 @@
       <w:r>
         <w:fldChar w:fldCharType="separate"/>
       </w:r>
-      <w:hyperlink w:anchor="_Toc224899391" w:history="1">
+      <w:hyperlink w:anchor="_Toc231064306" w:history="1">
         <w:r>
           <w:rPr>
             <w:rStyle w:val="Hyperlink"/>
@@ -276,7 +276,7 @@
             <w:noProof/>
             <w:webHidden/>
           </w:rPr>
-          <w:instrText xml:space="preserve"> PAGEREF _Toc224899391 \h </w:instrText>
+          <w:instrText xml:space="preserve"> PAGEREF _Toc231064306 \h </w:instrText>
         </w:r>
         <w:r>
           <w:rPr>
@@ -296,7 +296,7 @@
             <w:noProof/>
             <w:webHidden/>
           </w:rPr>
-          <w:t>3</w:t>
+          <w:t>4</w:t>
         </w:r>
         <w:r>
           <w:rPr>
@@ -317,7 +317,7 @@
           <w:color w:val="auto"/>
         </w:rPr>
       </w:pPr>
-      <w:hyperlink w:anchor="_Toc224899392" w:history="1">
+      <w:hyperlink w:anchor="_Toc231064307" w:history="1">
         <w:r>
           <w:rPr>
             <w:rStyle w:val="Hyperlink"/>
@@ -344,7 +344,7 @@
             <w:noProof/>
             <w:webHidden/>
           </w:rPr>
-          <w:instrText xml:space="preserve"> PAGEREF _Toc224899392 \h </w:instrText>
+          <w:instrText xml:space="preserve"> PAGEREF _Toc231064307 \h </w:instrText>
         </w:r>
         <w:r>
           <w:rPr>
@@ -364,7 +364,7 @@
             <w:noProof/>
             <w:webHidden/>
           </w:rPr>
-          <w:t>4</w:t>
+          <w:t>5</w:t>
         </w:r>
         <w:r>
           <w:rPr>
@@ -384,7 +384,7 @@
           <w:color w:val="auto"/>
         </w:rPr>
       </w:pPr>
-      <w:hyperlink w:anchor="_Toc224899393" w:history="1">
+      <w:hyperlink w:anchor="_Toc231064308" w:history="1">
         <w:r>
           <w:rPr>
             <w:rStyle w:val="Hyperlink"/>
@@ -411,7 +411,7 @@
             <w:noProof/>
             <w:webHidden/>
           </w:rPr>
-          <w:instrText xml:space="preserve"> PAGEREF _Toc224899393 \h </w:instrText>
+          <w:instrText xml:space="preserve"> PAGEREF _Toc231064308 \h </w:instrText>
         </w:r>
         <w:r>
           <w:rPr>
@@ -431,7 +431,7 @@
             <w:noProof/>
             <w:webHidden/>
           </w:rPr>
-          <w:t>4</w:t>
+          <w:t>5</w:t>
         </w:r>
         <w:r>
           <w:rPr>
@@ -451,7 +451,7 @@
           <w:color w:val="auto"/>
         </w:rPr>
       </w:pPr>
-      <w:hyperlink w:anchor="_Toc224899394" w:history="1">
+      <w:hyperlink w:anchor="_Toc231064309" w:history="1">
         <w:r>
           <w:rPr>
             <w:rStyle w:val="Hyperlink"/>
@@ -478,7 +478,7 @@
             <w:noProof/>
             <w:webHidden/>
           </w:rPr>
-          <w:instrText xml:space="preserve"> PAGEREF _Toc224899394 \h </w:instrText>
+          <w:instrText xml:space="preserve"> PAGEREF _Toc231064309 \h </w:instrText>
         </w:r>
         <w:r>
           <w:rPr>
@@ -498,7 +498,7 @@
             <w:noProof/>
             <w:webHidden/>
           </w:rPr>
-          <w:t>4</w:t>
+          <w:t>5</w:t>
         </w:r>
         <w:r>
           <w:rPr>
@@ -519,13 +519,13 @@
           <w:color w:val="auto"/>
         </w:rPr>
       </w:pPr>
-      <w:hyperlink w:anchor="_Toc224899395" w:history="1">
+      <w:hyperlink w:anchor="_Toc231064310" w:history="1">
         <w:r>
           <w:rPr>
             <w:rStyle w:val="Hyperlink"/>
             <w:noProof/>
           </w:rPr>
-          <w:t>2. Архитектурна система</w:t>
+          <w:t>2. Архитектура на системата</w:t>
         </w:r>
         <w:r>
           <w:rPr>
@@ -546,7 +546,7 @@
             <w:noProof/>
             <w:webHidden/>
           </w:rPr>
-          <w:instrText xml:space="preserve"> PAGEREF _Toc224899395 \h </w:instrText>
+          <w:instrText xml:space="preserve"> PAGEREF _Toc231064310 \h </w:instrText>
         </w:r>
         <w:r>
           <w:rPr>
@@ -566,7 +566,7 @@
             <w:noProof/>
             <w:webHidden/>
           </w:rPr>
-          <w:t>5</w:t>
+          <w:t>6</w:t>
         </w:r>
         <w:r>
           <w:rPr>
@@ -587,7 +587,7 @@
           <w:color w:val="auto"/>
         </w:rPr>
       </w:pPr>
-      <w:hyperlink w:anchor="_Toc224899396" w:history="1">
+      <w:hyperlink w:anchor="_Toc231064311" w:history="1">
         <w:r>
           <w:rPr>
             <w:rStyle w:val="Hyperlink"/>
@@ -614,7 +614,7 @@
             <w:noProof/>
             <w:webHidden/>
           </w:rPr>
-          <w:instrText xml:space="preserve"> PAGEREF _Toc224899396 \h </w:instrText>
+          <w:instrText xml:space="preserve"> PAGEREF _Toc231064311 \h </w:instrText>
         </w:r>
         <w:r>
           <w:rPr>
@@ -634,7 +634,7 @@
             <w:noProof/>
             <w:webHidden/>
           </w:rPr>
-          <w:t>6</w:t>
+          <w:t>7</w:t>
         </w:r>
         <w:r>
           <w:rPr>
@@ -654,7 +654,7 @@
           <w:color w:val="auto"/>
         </w:rPr>
       </w:pPr>
-      <w:hyperlink w:anchor="_Toc224899397" w:history="1">
+      <w:hyperlink w:anchor="_Toc231064312" w:history="1">
         <w:r>
           <w:rPr>
             <w:rStyle w:val="Hyperlink"/>
@@ -681,7 +681,7 @@
             <w:noProof/>
             <w:webHidden/>
           </w:rPr>
-          <w:instrText xml:space="preserve"> PAGEREF _Toc224899397 \h </w:instrText>
+          <w:instrText xml:space="preserve"> PAGEREF _Toc231064312 \h </w:instrText>
         </w:r>
         <w:r>
           <w:rPr>
@@ -701,7 +701,7 @@
             <w:noProof/>
             <w:webHidden/>
           </w:rPr>
-          <w:t>6</w:t>
+          <w:t>7</w:t>
         </w:r>
         <w:r>
           <w:rPr>
@@ -721,7 +721,7 @@
           <w:color w:val="auto"/>
         </w:rPr>
       </w:pPr>
-      <w:hyperlink w:anchor="_Toc224899398" w:history="1">
+      <w:hyperlink w:anchor="_Toc231064313" w:history="1">
         <w:r>
           <w:rPr>
             <w:rStyle w:val="Hyperlink"/>
@@ -748,7 +748,7 @@
             <w:noProof/>
             <w:webHidden/>
           </w:rPr>
-          <w:instrText xml:space="preserve"> PAGEREF _Toc224899398 \h </w:instrText>
+          <w:instrText xml:space="preserve"> PAGEREF _Toc231064313 \h </w:instrText>
         </w:r>
         <w:r>
           <w:rPr>
@@ -768,7 +768,7 @@
             <w:noProof/>
             <w:webHidden/>
           </w:rPr>
-          <w:t>6</w:t>
+          <w:t>7</w:t>
         </w:r>
         <w:r>
           <w:rPr>
@@ -789,7 +789,7 @@
           <w:color w:val="auto"/>
         </w:rPr>
       </w:pPr>
-      <w:hyperlink w:anchor="_Toc224899399" w:history="1">
+      <w:hyperlink w:anchor="_Toc231064314" w:history="1">
         <w:r>
           <w:rPr>
             <w:rStyle w:val="Hyperlink"/>
@@ -816,7 +816,7 @@
             <w:noProof/>
             <w:webHidden/>
           </w:rPr>
-          <w:instrText xml:space="preserve"> PAGEREF _Toc224899399 \h </w:instrText>
+          <w:instrText xml:space="preserve"> PAGEREF _Toc231064314 \h </w:instrText>
         </w:r>
         <w:r>
           <w:rPr>
@@ -836,7 +836,7 @@
             <w:noProof/>
             <w:webHidden/>
           </w:rPr>
-          <w:t>7</w:t>
+          <w:t>8</w:t>
         </w:r>
         <w:r>
           <w:rPr>
@@ -856,13 +856,21 @@
           <w:color w:val="auto"/>
         </w:rPr>
       </w:pPr>
-      <w:hyperlink w:anchor="_Toc224899400" w:history="1">
+      <w:hyperlink w:anchor="_Toc231064315" w:history="1">
         <w:r>
           <w:rPr>
             <w:rStyle w:val="Hyperlink"/>
             <w:noProof/>
           </w:rPr>
-          <w:t>4.1 Фаза 1: Модул за двоично извличане (pst_extractor.py)</w:t>
+          <w:t xml:space="preserve">4.1 Модул с бизнес логика </w:t>
+        </w:r>
+        <w:r>
+          <w:rPr>
+            <w:rStyle w:val="Hyperlink"/>
+            <w:noProof/>
+            <w:lang w:val="en-US"/>
+          </w:rPr>
+          <w:t>(main.py)</w:t>
         </w:r>
         <w:r>
           <w:rPr>
@@ -883,7 +891,7 @@
             <w:noProof/>
             <w:webHidden/>
           </w:rPr>
-          <w:instrText xml:space="preserve"> PAGEREF _Toc224899400 \h </w:instrText>
+          <w:instrText xml:space="preserve"> PAGEREF _Toc231064315 \h </w:instrText>
         </w:r>
         <w:r>
           <w:rPr>
@@ -903,7 +911,7 @@
             <w:noProof/>
             <w:webHidden/>
           </w:rPr>
-          <w:t>7</w:t>
+          <w:t>8</w:t>
         </w:r>
         <w:r>
           <w:rPr>
@@ -923,13 +931,28 @@
           <w:color w:val="auto"/>
         </w:rPr>
       </w:pPr>
-      <w:hyperlink w:anchor="_Toc224899401" w:history="1">
+      <w:hyperlink w:anchor="_Toc231064327" w:history="1">
         <w:r>
           <w:rPr>
             <w:rStyle w:val="Hyperlink"/>
             <w:noProof/>
           </w:rPr>
-          <w:t>4.2 Фаза 2: Модул за дезинфекция на данни (filter_emails.py)</w:t>
+          <w:t>4.2 Главен модул за изпълнение (</w:t>
+        </w:r>
+        <w:r>
+          <w:rPr>
+            <w:rStyle w:val="Hyperlink"/>
+            <w:noProof/>
+            <w:lang w:val="en-US"/>
+          </w:rPr>
+          <w:t>main</w:t>
+        </w:r>
+        <w:r>
+          <w:rPr>
+            <w:rStyle w:val="Hyperlink"/>
+            <w:noProof/>
+          </w:rPr>
+          <w:t>.py)</w:t>
         </w:r>
         <w:r>
           <w:rPr>
@@ -950,7 +973,7 @@
             <w:noProof/>
             <w:webHidden/>
           </w:rPr>
-          <w:instrText xml:space="preserve"> PAGEREF _Toc224899401 \h </w:instrText>
+          <w:instrText xml:space="preserve"> PAGEREF _Toc231064327 \h </w:instrText>
         </w:r>
         <w:r>
           <w:rPr>
@@ -970,7 +993,7 @@
             <w:noProof/>
             <w:webHidden/>
           </w:rPr>
-          <w:t>7</w:t>
+          <w:t>9</w:t>
         </w:r>
         <w:r>
           <w:rPr>
@@ -991,7 +1014,7 @@
           <w:color w:val="auto"/>
         </w:rPr>
       </w:pPr>
-      <w:hyperlink w:anchor="_Toc224899402" w:history="1">
+      <w:hyperlink w:anchor="_Toc231064329" w:history="1">
         <w:r>
           <w:rPr>
             <w:rStyle w:val="Hyperlink"/>
@@ -1018,7 +1041,7 @@
             <w:noProof/>
             <w:webHidden/>
           </w:rPr>
-          <w:instrText xml:space="preserve"> PAGEREF _Toc224899402 \h </w:instrText>
+          <w:instrText xml:space="preserve"> PAGEREF _Toc231064329 \h </w:instrText>
         </w:r>
         <w:r>
           <w:rPr>
@@ -1038,7 +1061,7 @@
             <w:noProof/>
             <w:webHidden/>
           </w:rPr>
-          <w:t>8</w:t>
+          <w:t>10</w:t>
         </w:r>
         <w:r>
           <w:rPr>
@@ -1058,7 +1081,7 @@
           <w:color w:val="auto"/>
         </w:rPr>
       </w:pPr>
-      <w:hyperlink w:anchor="_Toc224899403" w:history="1">
+      <w:hyperlink w:anchor="_Toc231064330" w:history="1">
         <w:r>
           <w:rPr>
             <w:rStyle w:val="Hyperlink"/>
@@ -1085,7 +1108,7 @@
             <w:noProof/>
             <w:webHidden/>
           </w:rPr>
-          <w:instrText xml:space="preserve"> PAGEREF _Toc224899403 \h </w:instrText>
+          <w:instrText xml:space="preserve"> PAGEREF _Toc231064330 \h </w:instrText>
         </w:r>
         <w:r>
           <w:rPr>
@@ -1105,7 +1128,7 @@
             <w:noProof/>
             <w:webHidden/>
           </w:rPr>
-          <w:t>8</w:t>
+          <w:t>10</w:t>
         </w:r>
         <w:r>
           <w:rPr>
@@ -1125,7 +1148,7 @@
           <w:color w:val="auto"/>
         </w:rPr>
       </w:pPr>
-      <w:hyperlink w:anchor="_Toc224899404" w:history="1">
+      <w:hyperlink w:anchor="_Toc231064331" w:history="1">
         <w:r>
           <w:rPr>
             <w:rStyle w:val="Hyperlink"/>
@@ -1152,7 +1175,7 @@
             <w:noProof/>
             <w:webHidden/>
           </w:rPr>
-          <w:instrText xml:space="preserve"> PAGEREF _Toc224899404 \h </w:instrText>
+          <w:instrText xml:space="preserve"> PAGEREF _Toc231064331 \h </w:instrText>
         </w:r>
         <w:r>
           <w:rPr>
@@ -1172,7 +1195,7 @@
             <w:noProof/>
             <w:webHidden/>
           </w:rPr>
-          <w:t>8</w:t>
+          <w:t>10</w:t>
         </w:r>
         <w:r>
           <w:rPr>
@@ -1192,7 +1215,7 @@
           <w:color w:val="auto"/>
         </w:rPr>
       </w:pPr>
-      <w:hyperlink w:anchor="_Toc224899405" w:history="1">
+      <w:hyperlink w:anchor="_Toc231064332" w:history="1">
         <w:r>
           <w:rPr>
             <w:rStyle w:val="Hyperlink"/>
@@ -1219,7 +1242,7 @@
             <w:noProof/>
             <w:webHidden/>
           </w:rPr>
-          <w:instrText xml:space="preserve"> PAGEREF _Toc224899405 \h </w:instrText>
+          <w:instrText xml:space="preserve"> PAGEREF _Toc231064332 \h </w:instrText>
         </w:r>
         <w:r>
           <w:rPr>
@@ -1239,7 +1262,7 @@
             <w:noProof/>
             <w:webHidden/>
           </w:rPr>
-          <w:t>8</w:t>
+          <w:t>10</w:t>
         </w:r>
         <w:r>
           <w:rPr>
@@ -1260,7 +1283,7 @@
           <w:color w:val="auto"/>
         </w:rPr>
       </w:pPr>
-      <w:hyperlink w:anchor="_Toc224899406" w:history="1">
+      <w:hyperlink w:anchor="_Toc231064333" w:history="1">
         <w:r>
           <w:rPr>
             <w:rStyle w:val="Hyperlink"/>
@@ -1287,7 +1310,7 @@
             <w:noProof/>
             <w:webHidden/>
           </w:rPr>
-          <w:instrText xml:space="preserve"> PAGEREF _Toc224899406 \h </w:instrText>
+          <w:instrText xml:space="preserve"> PAGEREF _Toc231064333 \h </w:instrText>
         </w:r>
         <w:r>
           <w:rPr>
@@ -1307,7 +1330,7 @@
             <w:noProof/>
             <w:webHidden/>
           </w:rPr>
-          <w:t>8</w:t>
+          <w:t>11</w:t>
         </w:r>
         <w:r>
           <w:rPr>
@@ -1327,7 +1350,7 @@
           <w:color w:val="auto"/>
         </w:rPr>
       </w:pPr>
-      <w:hyperlink w:anchor="_Toc224899407" w:history="1">
+      <w:hyperlink w:anchor="_Toc231064334" w:history="1">
         <w:r>
           <w:rPr>
             <w:rStyle w:val="Hyperlink"/>
@@ -1354,7 +1377,7 @@
             <w:noProof/>
             <w:webHidden/>
           </w:rPr>
-          <w:instrText xml:space="preserve"> PAGEREF _Toc224899407 \h </w:instrText>
+          <w:instrText xml:space="preserve"> PAGEREF _Toc231064334 \h </w:instrText>
         </w:r>
         <w:r>
           <w:rPr>
@@ -1374,7 +1397,7 @@
             <w:noProof/>
             <w:webHidden/>
           </w:rPr>
-          <w:t>9</w:t>
+          <w:t>11</w:t>
         </w:r>
         <w:r>
           <w:rPr>
@@ -1388,19 +1411,37 @@
     <w:p>
       <w:pPr>
         <w:pStyle w:val="TOC2"/>
+        <w:tabs>
+          <w:tab w:val="left" w:pos="960"/>
+        </w:tabs>
         <w:rPr>
           <w:rFonts w:asciiTheme="minorHAnsi" w:eastAsiaTheme="minorEastAsia" w:hAnsiTheme="minorHAnsi"/>
           <w:noProof/>
           <w:color w:val="auto"/>
         </w:rPr>
       </w:pPr>
-      <w:hyperlink w:anchor="_Toc224899408" w:history="1">
+      <w:hyperlink w:anchor="_Toc231064335" w:history="1">
         <w:r>
           <w:rPr>
             <w:rStyle w:val="Hyperlink"/>
             <w:noProof/>
           </w:rPr>
-          <w:t>6.2 Защо този подход</w:t>
+          <w:t>6.2</w:t>
+        </w:r>
+        <w:r>
+          <w:rPr>
+            <w:rFonts w:asciiTheme="minorHAnsi" w:eastAsiaTheme="minorEastAsia" w:hAnsiTheme="minorHAnsi"/>
+            <w:noProof/>
+            <w:color w:val="auto"/>
+          </w:rPr>
+          <w:t xml:space="preserve"> </w:t>
+        </w:r>
+        <w:r>
+          <w:rPr>
+            <w:rStyle w:val="Hyperlink"/>
+            <w:noProof/>
+          </w:rPr>
+          <w:t>Защо този подход</w:t>
         </w:r>
         <w:r>
           <w:rPr>
@@ -1421,7 +1462,7 @@
             <w:noProof/>
             <w:webHidden/>
           </w:rPr>
-          <w:instrText xml:space="preserve"> PAGEREF _Toc224899408 \h </w:instrText>
+          <w:instrText xml:space="preserve"> PAGEREF _Toc231064335 \h </w:instrText>
         </w:r>
         <w:r>
           <w:rPr>
@@ -1441,7 +1482,7 @@
             <w:noProof/>
             <w:webHidden/>
           </w:rPr>
-          <w:t>9</w:t>
+          <w:t>11</w:t>
         </w:r>
         <w:r>
           <w:rPr>
@@ -1461,13 +1502,13 @@
           <w:color w:val="auto"/>
         </w:rPr>
       </w:pPr>
-      <w:hyperlink w:anchor="_Toc224899409" w:history="1">
+      <w:hyperlink w:anchor="_Toc231064336" w:history="1">
         <w:r>
           <w:rPr>
             <w:rStyle w:val="Hyperlink"/>
             <w:noProof/>
           </w:rPr>
-          <w:t>6.3 Ограничения</w:t>
+          <w:t>6.3 Лимитации</w:t>
         </w:r>
         <w:r>
           <w:rPr>
@@ -1488,7 +1529,7 @@
             <w:noProof/>
             <w:webHidden/>
           </w:rPr>
-          <w:instrText xml:space="preserve"> PAGEREF _Toc224899409 \h </w:instrText>
+          <w:instrText xml:space="preserve"> PAGEREF _Toc231064336 \h </w:instrText>
         </w:r>
         <w:r>
           <w:rPr>
@@ -1508,7 +1549,7 @@
             <w:noProof/>
             <w:webHidden/>
           </w:rPr>
-          <w:t>9</w:t>
+          <w:t>11</w:t>
         </w:r>
         <w:r>
           <w:rPr>
@@ -1529,7 +1570,7 @@
           <w:color w:val="auto"/>
         </w:rPr>
       </w:pPr>
-      <w:hyperlink w:anchor="_Toc224899410" w:history="1">
+      <w:hyperlink w:anchor="_Toc231064337" w:history="1">
         <w:r>
           <w:rPr>
             <w:rStyle w:val="Hyperlink"/>
@@ -1556,7 +1597,7 @@
             <w:noProof/>
             <w:webHidden/>
           </w:rPr>
-          <w:instrText xml:space="preserve"> PAGEREF _Toc224899410 \h </w:instrText>
+          <w:instrText xml:space="preserve"> PAGEREF _Toc231064337 \h </w:instrText>
         </w:r>
         <w:r>
           <w:rPr>
@@ -1576,7 +1617,7 @@
             <w:noProof/>
             <w:webHidden/>
           </w:rPr>
-          <w:t>10</w:t>
+          <w:t>12</w:t>
         </w:r>
         <w:r>
           <w:rPr>
@@ -1606,7 +1647,7 @@
         <w:pStyle w:val="Heading1"/>
       </w:pPr>
       <w:bookmarkStart w:id="0" w:name="_Toc000"/>
-      <w:bookmarkStart w:id="1" w:name="_Toc224899391"/>
+      <w:bookmarkStart w:id="1" w:name="_Toc231064306"/>
       <w:r>
         <w:lastRenderedPageBreak/>
         <w:t>Резюме</w:t>
@@ -1669,7 +1710,7 @@
         <w:pStyle w:val="Heading1"/>
       </w:pPr>
       <w:bookmarkStart w:id="2" w:name="_Toc001"/>
-      <w:bookmarkStart w:id="3" w:name="_Toc224899392"/>
+      <w:bookmarkStart w:id="3" w:name="_Toc231064307"/>
       <w:r>
         <w:lastRenderedPageBreak/>
         <w:t>1. Анализ на изискванията</w:t>
@@ -1681,7 +1722,7 @@
       <w:pPr>
         <w:pStyle w:val="Heading2"/>
       </w:pPr>
-      <w:bookmarkStart w:id="4" w:name="_Toc224899393"/>
+      <w:bookmarkStart w:id="4" w:name="_Toc231064308"/>
       <w:r>
         <w:t>1.1 Функционални изисквания</w:t>
       </w:r>
@@ -1762,24 +1803,24 @@
     </w:p>
     <w:p>
       <w:pPr>
-        <w:pStyle w:val="Heading2"/>
-      </w:pPr>
-      <w:bookmarkStart w:id="5" w:name="_Toc224899394"/>
-      <w:r>
-        <w:t>1.2 Технически ограничения</w:t>
-      </w:r>
-      <w:bookmarkEnd w:id="5"/>
-    </w:p>
-    <w:p>
-      <w:pPr>
         <w:numPr>
           <w:ilvl w:val="0"/>
           <w:numId w:val="2"/>
         </w:numPr>
       </w:pPr>
       <w:r>
-        <w:t>Windows 10/11 хост среда (академично лабораторно ограничение)</w:t>
-      </w:r>
+        <w:t>Сортиране на крайния резултат по азбучен ред</w:t>
+      </w:r>
+    </w:p>
+    <w:p>
+      <w:pPr>
+        <w:pStyle w:val="Heading2"/>
+      </w:pPr>
+      <w:bookmarkStart w:id="5" w:name="_Toc231064309"/>
+      <w:r>
+        <w:t>1.2 Технически ограничения</w:t>
+      </w:r>
+      <w:bookmarkEnd w:id="5"/>
     </w:p>
     <w:p>
       <w:pPr>
@@ -1789,13 +1830,7 @@
         </w:numPr>
       </w:pPr>
       <w:r>
-        <w:t>Не е задължителна наличност на лицензиран</w:t>
-      </w:r>
-      <w:r>
-        <w:t xml:space="preserve"> търговски софтуер (Outlook</w:t>
-      </w:r>
-      <w:r>
-        <w:t>)</w:t>
+        <w:t>Windows 10/11 хост среда (академично лабораторно ограничение)</w:t>
       </w:r>
     </w:p>
     <w:p>
@@ -1806,16 +1841,13 @@
         </w:numPr>
       </w:pPr>
       <w:r>
-        <w:t xml:space="preserve">Ефективна обработка </w:t>
-      </w:r>
-      <w:r>
-        <w:t>големи набори от данни (&gt;10</w:t>
-      </w:r>
-      <w:r>
-        <w:t xml:space="preserve"> хил.</w:t>
-      </w:r>
-      <w:r>
-        <w:t xml:space="preserve"> съобщения)</w:t>
+        <w:t>Не е задължителна наличност на лицензиран</w:t>
+      </w:r>
+      <w:r>
+        <w:t xml:space="preserve"> търговски софтуер (Outlook</w:t>
+      </w:r>
+      <w:r>
+        <w:t>)</w:t>
       </w:r>
     </w:p>
     <w:p>
@@ -1826,676 +1858,16 @@
         </w:numPr>
       </w:pPr>
       <w:r>
-        <w:t>Съответствие с кодиране на UTF-8 за международни имейл адреси</w:t>
-      </w:r>
-    </w:p>
-    <w:p>
-      <w:pPr>
-        <w:pStyle w:val="Heading1"/>
-      </w:pPr>
-      <w:bookmarkStart w:id="6" w:name="_Toc002"/>
-      <w:bookmarkStart w:id="7" w:name="_Toc224899395"/>
-      <w:r>
-        <w:lastRenderedPageBreak/>
-        <w:t>2. Архитектур</w:t>
-      </w:r>
-      <w:bookmarkEnd w:id="6"/>
-      <w:bookmarkEnd w:id="7"/>
-      <w:r>
-        <w:t>а на системата</w:t>
-      </w:r>
-    </w:p>
-    <w:p>
-      <w:r>
-        <w:t>Следната диаграма илюстрира пълния процес на обработка на данни от въвеждане на PST файлове до чист CSV изход:</w:t>
-      </w:r>
-    </w:p>
-    <w:p>
-      <w:pPr>
-        <w:pStyle w:val="Code"/>
-      </w:pPr>
-      <w:r>
-        <w:t>+-----------------+     +--------------+     +-----------------+</w:t>
-      </w:r>
-    </w:p>
-    <w:p>
-      <w:pPr>
-        <w:pStyle w:val="Code"/>
-      </w:pPr>
-      <w:r>
-        <w:t xml:space="preserve">|   Windows FS </w:t>
-      </w:r>
-      <w:r>
-        <w:rPr>
-          <w:lang w:val="en-US"/>
-        </w:rPr>
-        <w:t xml:space="preserve">   </w:t>
-      </w:r>
-      <w:r>
-        <w:t xml:space="preserve">|----&gt;|  WSL Ubuntu </w:t>
-      </w:r>
-      <w:r>
-        <w:rPr>
-          <w:lang w:val="en-US"/>
-        </w:rPr>
-        <w:t xml:space="preserve"> </w:t>
-      </w:r>
-      <w:r>
-        <w:t>|----&gt;|  PST парсер</w:t>
-      </w:r>
-      <w:r>
-        <w:rPr>
-          <w:lang w:val="en-US"/>
-        </w:rPr>
-        <w:t xml:space="preserve">    </w:t>
-      </w:r>
-      <w:r>
-        <w:t xml:space="preserve"> |</w:t>
-      </w:r>
-    </w:p>
-    <w:p>
-      <w:pPr>
-        <w:pStyle w:val="Code"/>
-      </w:pPr>
-      <w:r>
-        <w:t>|  (</w:t>
-      </w:r>
-      <w:r>
-        <w:rPr>
-          <w:lang w:val="en-US"/>
-        </w:rPr>
-        <w:t>backup</w:t>
-      </w:r>
-      <w:r>
-        <w:t xml:space="preserve">.pst) </w:t>
-      </w:r>
-      <w:r>
-        <w:rPr>
-          <w:lang w:val="en-US"/>
-        </w:rPr>
-        <w:t xml:space="preserve">  </w:t>
-      </w:r>
-      <w:r>
-        <w:t>|     |  (</w:t>
-      </w:r>
-      <w:proofErr w:type="spellStart"/>
-      <w:r>
-        <w:rPr>
-          <w:lang w:val="en-US"/>
-        </w:rPr>
-        <w:t>libpst</w:t>
-      </w:r>
-      <w:proofErr w:type="spellEnd"/>
-      <w:r>
-        <w:t>)</w:t>
-      </w:r>
-      <w:r>
-        <w:rPr>
-          <w:lang w:val="en-US"/>
-        </w:rPr>
-        <w:t xml:space="preserve">   </w:t>
-      </w:r>
-      <w:r>
-        <w:t xml:space="preserve"> |     |  (</w:t>
-      </w:r>
-      <w:proofErr w:type="spellStart"/>
-      <w:r>
-        <w:rPr>
-          <w:lang w:val="en-US"/>
-        </w:rPr>
-        <w:t>readpst</w:t>
-      </w:r>
-      <w:proofErr w:type="spellEnd"/>
-      <w:r>
-        <w:t xml:space="preserve">) </w:t>
-      </w:r>
-      <w:r>
-        <w:rPr>
-          <w:lang w:val="en-US"/>
-        </w:rPr>
-        <w:t xml:space="preserve">     </w:t>
-      </w:r>
-      <w:r>
-        <w:t>|</w:t>
-      </w:r>
-    </w:p>
-    <w:p>
-      <w:pPr>
-        <w:pStyle w:val="Code"/>
-      </w:pPr>
-      <w:r>
-        <w:t>+-----------------+     +--------------+     +--------+--------+</w:t>
-      </w:r>
-    </w:p>
-    <w:p>
-      <w:pPr>
-        <w:pStyle w:val="Code"/>
-      </w:pPr>
-      <w:r>
-        <w:t xml:space="preserve">                                                      |</w:t>
-      </w:r>
-    </w:p>
-    <w:p>
-      <w:pPr>
-        <w:pStyle w:val="Code"/>
-      </w:pPr>
-      <w:r>
-        <w:t xml:space="preserve">                           +--------------------------------------------+</w:t>
-      </w:r>
-    </w:p>
-    <w:p>
-      <w:pPr>
-        <w:pStyle w:val="Code"/>
-      </w:pPr>
-      <w:r>
-        <w:t xml:space="preserve">                           |                          |                 |</w:t>
-      </w:r>
-    </w:p>
-    <w:p>
-      <w:pPr>
-        <w:pStyle w:val="Code"/>
-      </w:pPr>
-      <w:r>
-        <w:t xml:space="preserve">                           v </w:t>
-      </w:r>
-      <w:r>
-        <w:t xml:space="preserve">                         </w:t>
-      </w:r>
-      <w:r>
-        <w:t>v</w:t>
-      </w:r>
-      <w:r>
-        <w:t xml:space="preserve">                </w:t>
-      </w:r>
-      <w:r>
-        <w:t xml:space="preserve"> v</w:t>
-      </w:r>
-    </w:p>
-    <w:p>
-      <w:pPr>
-        <w:pStyle w:val="Code"/>
-      </w:pPr>
-      <w:r>
-        <w:t xml:space="preserve">                  +-------------+           +--------------+      +--------------+</w:t>
-      </w:r>
-    </w:p>
-    <w:p>
-      <w:pPr>
-        <w:pStyle w:val="Code"/>
-      </w:pPr>
-      <w:r>
-        <w:t xml:space="preserve">                  |  MBOX/EML </w:t>
-      </w:r>
-      <w:r>
-        <w:t xml:space="preserve">  </w:t>
-      </w:r>
-      <w:r>
-        <w:t xml:space="preserve">|----------&gt;|  Python3 </w:t>
-      </w:r>
-      <w:r>
-        <w:t xml:space="preserve">    </w:t>
-      </w:r>
-      <w:r>
-        <w:t xml:space="preserve">|-----&gt;|  Regex </w:t>
-      </w:r>
-      <w:r>
-        <w:t xml:space="preserve">      </w:t>
-      </w:r>
-      <w:r>
-        <w:t>|</w:t>
-      </w:r>
-    </w:p>
-    <w:p>
-      <w:pPr>
-        <w:pStyle w:val="Code"/>
-      </w:pPr>
-      <w:r>
-        <w:t xml:space="preserve">                  |  </w:t>
-      </w:r>
-      <w:r>
-        <w:t>Извличане</w:t>
-      </w:r>
-      <w:r>
-        <w:t xml:space="preserve"> </w:t>
-      </w:r>
-      <w:r>
-        <w:t xml:space="preserve"> </w:t>
-      </w:r>
-      <w:r>
-        <w:t xml:space="preserve">|           |  Екстрактор </w:t>
-      </w:r>
-      <w:r>
-        <w:t xml:space="preserve"> </w:t>
-      </w:r>
-      <w:r>
-        <w:t xml:space="preserve">|      |  </w:t>
-      </w:r>
-      <w:r>
-        <w:t>Енджин</w:t>
-      </w:r>
-      <w:r>
-        <w:t xml:space="preserve"> </w:t>
-      </w:r>
-      <w:r>
-        <w:t xml:space="preserve">     </w:t>
-      </w:r>
-      <w:r>
-        <w:t>|</w:t>
-      </w:r>
-    </w:p>
-    <w:p>
-      <w:pPr>
-        <w:pStyle w:val="Code"/>
-      </w:pPr>
-      <w:r>
-        <w:t xml:space="preserve">                  +-------------+           +--------------+      +--------------+</w:t>
-      </w:r>
-    </w:p>
-    <w:p>
-      <w:pPr>
-        <w:pStyle w:val="Code"/>
-      </w:pPr>
-      <w:r>
-        <w:t xml:space="preserve">                                                                          |</w:t>
-      </w:r>
-    </w:p>
-    <w:p>
-      <w:pPr>
-        <w:pStyle w:val="Code"/>
-      </w:pPr>
-      <w:r>
-        <w:t xml:space="preserve">                                                                          v</w:t>
-      </w:r>
-    </w:p>
-    <w:p>
-      <w:pPr>
-        <w:pStyle w:val="Code"/>
-      </w:pPr>
-      <w:r>
-        <w:t xml:space="preserve">                                                                   +--------------+</w:t>
-      </w:r>
-    </w:p>
-    <w:p>
-      <w:pPr>
-        <w:pStyle w:val="Code"/>
-      </w:pPr>
-      <w:r>
-        <w:t xml:space="preserve">                                                                   |  </w:t>
-      </w:r>
-      <w:r>
-        <w:rPr>
-          <w:lang w:val="en-US"/>
-        </w:rPr>
-        <w:t>addresses</w:t>
-      </w:r>
-      <w:r>
-        <w:t>.  |</w:t>
-      </w:r>
-    </w:p>
-    <w:p>
-      <w:pPr>
-        <w:pStyle w:val="Code"/>
-      </w:pPr>
-      <w:r>
-        <w:t xml:space="preserve">                                                                   |  </w:t>
-      </w:r>
-      <w:r>
-        <w:rPr>
-          <w:lang w:val="en-US"/>
-        </w:rPr>
-        <w:t>csv</w:t>
-      </w:r>
-      <w:r>
-        <w:t xml:space="preserve"> (RAW) </w:t>
-      </w:r>
-      <w:r>
-        <w:rPr>
-          <w:lang w:val="en-US"/>
-        </w:rPr>
-        <w:t xml:space="preserve">  </w:t>
-      </w:r>
-      <w:r>
-        <w:t>|</w:t>
-      </w:r>
-    </w:p>
-    <w:p>
-      <w:pPr>
-        <w:pStyle w:val="Code"/>
-      </w:pPr>
-      <w:r>
-        <w:t xml:space="preserve">                                                                   +------+-------+</w:t>
-      </w:r>
-    </w:p>
-    <w:p>
-      <w:pPr>
-        <w:pStyle w:val="Code"/>
-      </w:pPr>
-      <w:r>
-        <w:t xml:space="preserve">                                                                          |</w:t>
-      </w:r>
-    </w:p>
-    <w:p>
-      <w:pPr>
-        <w:pStyle w:val="Code"/>
-      </w:pPr>
-      <w:r>
-        <w:t xml:space="preserve">                                                                          v</w:t>
-      </w:r>
-    </w:p>
-    <w:p>
-      <w:pPr>
-        <w:pStyle w:val="Code"/>
-      </w:pPr>
-      <w:r>
-        <w:t xml:space="preserve">                                                                   +--------------+</w:t>
-      </w:r>
-    </w:p>
-    <w:p>
-      <w:pPr>
-        <w:pStyle w:val="Code"/>
-      </w:pPr>
-      <w:r>
-        <w:t xml:space="preserve">                                                                   |  </w:t>
-      </w:r>
-      <w:r>
-        <w:t>Филтриращ</w:t>
-      </w:r>
-      <w:r>
-        <w:t xml:space="preserve"> </w:t>
-      </w:r>
-      <w:r>
-        <w:t xml:space="preserve">  </w:t>
-      </w:r>
-      <w:r>
-        <w:t>|</w:t>
-      </w:r>
-    </w:p>
-    <w:p>
-      <w:pPr>
-        <w:pStyle w:val="Code"/>
-      </w:pPr>
-      <w:r>
-        <w:t xml:space="preserve">                                                                   |  </w:t>
-      </w:r>
-      <w:r>
-        <w:t xml:space="preserve">скрипт     </w:t>
-      </w:r>
-      <w:r>
-        <w:t xml:space="preserve"> |</w:t>
-      </w:r>
-    </w:p>
-    <w:p>
-      <w:pPr>
-        <w:pStyle w:val="Code"/>
-      </w:pPr>
-      <w:r>
-        <w:t xml:space="preserve">                                                                   +------+-------+</w:t>
-      </w:r>
-    </w:p>
-    <w:p>
-      <w:pPr>
-        <w:pStyle w:val="Code"/>
-      </w:pPr>
-      <w:r>
-        <w:t xml:space="preserve">                                                                          v</w:t>
-      </w:r>
-    </w:p>
-    <w:p>
-      <w:pPr>
-        <w:pStyle w:val="Code"/>
-      </w:pPr>
-      <w:r>
-        <w:t xml:space="preserve">                                                                   +--------------+</w:t>
-      </w:r>
-    </w:p>
-    <w:p>
-      <w:pPr>
-        <w:pStyle w:val="Code"/>
-      </w:pPr>
-      <w:r>
-        <w:t xml:space="preserve">                                                                   |  addresses_ </w:t>
-      </w:r>
-      <w:r>
-        <w:t xml:space="preserve"> </w:t>
-      </w:r>
-      <w:r>
-        <w:t>|</w:t>
-      </w:r>
-    </w:p>
-    <w:p>
-      <w:pPr>
-        <w:pStyle w:val="Code"/>
-      </w:pPr>
-      <w:r>
-        <w:t xml:space="preserve">                                                                   |  clean.csv </w:t>
-      </w:r>
-      <w:r>
-        <w:t xml:space="preserve">  </w:t>
-      </w:r>
-      <w:r>
-        <w:t>|</w:t>
-      </w:r>
-    </w:p>
-    <w:p>
-      <w:pPr>
-        <w:pStyle w:val="Code"/>
-      </w:pPr>
-      <w:r>
-        <w:t xml:space="preserve">                                                                   +--------------+</w:t>
-      </w:r>
-    </w:p>
-    <w:p>
-      <w:pPr>
-        <w:pStyle w:val="Caption"/>
-      </w:pPr>
-      <w:r>
-        <w:t>Фигура 1: Преглед на системната архитектура</w:t>
-      </w:r>
-    </w:p>
-    <w:p>
-      <w:pPr>
-        <w:pStyle w:val="Heading1"/>
-      </w:pPr>
-      <w:bookmarkStart w:id="8" w:name="_Toc003"/>
-      <w:bookmarkStart w:id="9" w:name="_Toc224899396"/>
-      <w:r>
-        <w:lastRenderedPageBreak/>
-        <w:t>3. Настройка на средата (WSL конфигурация)</w:t>
-      </w:r>
-      <w:bookmarkEnd w:id="8"/>
-      <w:bookmarkEnd w:id="9"/>
-    </w:p>
-    <w:p>
-      <w:pPr>
-        <w:pStyle w:val="Heading2"/>
-      </w:pPr>
-      <w:bookmarkStart w:id="10" w:name="_Toc224899397"/>
-      <w:r>
-        <w:t>3.1 Инсталация</w:t>
-      </w:r>
-      <w:bookmarkEnd w:id="10"/>
-    </w:p>
-    <w:p>
-      <w:r>
-        <w:t xml:space="preserve">Изпълнение в </w:t>
-      </w:r>
-      <w:r>
-        <w:rPr>
-          <w:lang w:val="en-US"/>
-        </w:rPr>
-        <w:t>elevated</w:t>
-      </w:r>
-      <w:r>
-        <w:t xml:space="preserve"> PowerShell</w:t>
-      </w:r>
-      <w:r>
-        <w:rPr>
-          <w:lang w:val="en-US"/>
-        </w:rPr>
-        <w:t xml:space="preserve"> (</w:t>
-      </w:r>
-      <w:r>
-        <w:t>администраторски достъп</w:t>
-      </w:r>
-      <w:r>
-        <w:rPr>
-          <w:lang w:val="en-US"/>
-        </w:rPr>
-        <w:t>)</w:t>
-      </w:r>
-      <w:r>
-        <w:t>:</w:t>
-      </w:r>
-    </w:p>
-    <w:p>
-      <w:pPr>
-        <w:pStyle w:val="Code"/>
-      </w:pPr>
-      <w:r>
-        <w:t>wsl --install -d Ubuntu</w:t>
-      </w:r>
-    </w:p>
-    <w:p>
-      <w:pPr>
-        <w:spacing w:before="120"/>
-      </w:pPr>
-      <w:r>
-        <w:rPr>
-          <w:i/>
-          <w:color w:val="4A5568"/>
-        </w:rPr>
-        <w:t>Забележка: Необходимо е рестартиране на системата, за да се активират функциите на Virtual Machine Platform.</w:t>
-      </w:r>
-    </w:p>
-    <w:p>
-      <w:pPr>
-        <w:pStyle w:val="Heading2"/>
-      </w:pPr>
-      <w:bookmarkStart w:id="11" w:name="_Toc224899398"/>
-      <w:r>
-        <w:t>3.2 Разрешаване на зависимости</w:t>
-      </w:r>
-      <w:bookmarkEnd w:id="11"/>
-    </w:p>
-    <w:p>
-      <w:r>
-        <w:t xml:space="preserve">Отворете терминала на Ubuntu и обновете хранилища за пакети (критично за предотвратяване на </w:t>
-      </w:r>
-      <w:r>
-        <w:t>грешки тип „E: Unable to locate package“</w:t>
-      </w:r>
-      <w:r>
-        <w:t>):</w:t>
-      </w:r>
-    </w:p>
-    <w:p>
-      <w:pPr>
-        <w:pStyle w:val="Code"/>
-      </w:pPr>
-      <w:r>
-        <w:t>sudo apt-get update</w:t>
-      </w:r>
-    </w:p>
-    <w:p>
-      <w:pPr>
-        <w:pStyle w:val="Code"/>
-      </w:pPr>
-      <w:r>
-        <w:t>sudo apt-get install software-properties-common -y</w:t>
-      </w:r>
-    </w:p>
-    <w:p>
-      <w:pPr>
-        <w:pStyle w:val="Code"/>
-      </w:pPr>
-      <w:r>
-        <w:t>sudo add-apt-repository universe -y</w:t>
-      </w:r>
-    </w:p>
-    <w:p>
-      <w:pPr>
-        <w:pStyle w:val="Code"/>
-      </w:pPr>
-      <w:r>
-        <w:t>sudo apt-get update</w:t>
-      </w:r>
-    </w:p>
-    <w:p>
-      <w:pPr>
-        <w:pStyle w:val="Code"/>
-      </w:pPr>
-      <w:r>
-        <w:t>sudo apt-get install libpst-tools python3 -y</w:t>
-      </w:r>
-    </w:p>
-    <w:p>
-      <w:r>
-        <w:t>Проверка:</w:t>
-      </w:r>
-    </w:p>
-    <w:p>
-      <w:pPr>
-        <w:pStyle w:val="Code"/>
-      </w:pPr>
-      <w:r>
-        <w:t xml:space="preserve">readpst -V # Трябва да </w:t>
-      </w:r>
-      <w:r>
-        <w:t>изведе</w:t>
-      </w:r>
-      <w:r>
-        <w:t xml:space="preserve"> информация за версията на libpst</w:t>
-      </w:r>
-    </w:p>
-    <w:p>
-      <w:pPr>
-        <w:pStyle w:val="Heading1"/>
-      </w:pPr>
-      <w:bookmarkStart w:id="12" w:name="_Toc004"/>
-      <w:bookmarkStart w:id="13" w:name="_Toc224899399"/>
-      <w:r>
-        <w:lastRenderedPageBreak/>
-        <w:t>4. Реализация</w:t>
-      </w:r>
-      <w:bookmarkEnd w:id="12"/>
-      <w:bookmarkEnd w:id="13"/>
-    </w:p>
-    <w:p>
-      <w:pPr>
-        <w:pStyle w:val="Heading2"/>
-      </w:pPr>
-      <w:bookmarkStart w:id="14" w:name="_Toc224899400"/>
-      <w:r>
-        <w:t>4.1 Фаза 1: Модул за двоично извличане (pst_extractor.py)</w:t>
-      </w:r>
-      <w:bookmarkEnd w:id="14"/>
-    </w:p>
-    <w:p>
-      <w:r>
-        <w:t xml:space="preserve">Този скрипт действа като обвивка около readpst </w:t>
-      </w:r>
-      <w:r>
-        <w:t xml:space="preserve">библиотеката на </w:t>
-      </w:r>
-      <w:r>
-        <w:t xml:space="preserve">C, управлявайки временно управление на файлове и извличане на адреси на база regex от </w:t>
-      </w:r>
-      <w:r>
-        <w:t>хедъри</w:t>
-      </w:r>
-      <w:r>
-        <w:t xml:space="preserve"> на съобщенията.</w:t>
-      </w:r>
-    </w:p>
-    <w:p>
-      <w:pPr>
-        <w:spacing w:before="200"/>
-      </w:pPr>
-      <w:r>
-        <w:rPr>
-          <w:b/>
-        </w:rPr>
-        <w:t>Техническа обосновка:</w:t>
+        <w:t xml:space="preserve">Ефективна обработка </w:t>
+      </w:r>
+      <w:r>
+        <w:t>големи набори от данни (&gt;10</w:t>
+      </w:r>
+      <w:r>
+        <w:t xml:space="preserve"> хил.</w:t>
+      </w:r>
+      <w:r>
+        <w:t xml:space="preserve"> съобщения)</w:t>
       </w:r>
     </w:p>
     <w:p>
@@ -2506,7 +1878,7 @@
         </w:numPr>
       </w:pPr>
       <w:r>
-        <w:t>readpst конвертира PST елементите в RFC 2822 MBOX формат, позволявайки текстово парсиране</w:t>
+        <w:t>Съответствие с кодиране на UTF-8 за международни имейл адреси</w:t>
       </w:r>
     </w:p>
     <w:p>
@@ -2517,157 +1889,865 @@
         </w:numPr>
       </w:pPr>
       <w:r>
-        <w:t xml:space="preserve">Използването на временна </w:t>
-      </w:r>
-      <w:r>
-        <w:t xml:space="preserve">директория предотвратява </w:t>
-      </w:r>
-      <w:r>
-        <w:t>задръстването</w:t>
-      </w:r>
-      <w:r>
-        <w:t xml:space="preserve"> на файловата система</w:t>
-      </w:r>
-    </w:p>
-    <w:p>
-      <w:pPr>
-        <w:numPr>
-          <w:ilvl w:val="0"/>
-          <w:numId w:val="2"/>
-        </w:numPr>
-      </w:pPr>
-      <w:r>
-        <w:t>Структурите от данни от множества налагат дедупликация на O(1) по време на извличане</w:t>
-      </w:r>
+        <w:t>Обектно-ориентирана архитекрура с минимум два модула и клас с конструктор</w:t>
+      </w:r>
+    </w:p>
+    <w:p>
+      <w:pPr>
+        <w:pStyle w:val="Heading1"/>
+      </w:pPr>
+      <w:bookmarkStart w:id="6" w:name="_Toc002"/>
+      <w:bookmarkStart w:id="7" w:name="_Toc231064310"/>
+      <w:r>
+        <w:lastRenderedPageBreak/>
+        <w:t>2. Архитектур</w:t>
+      </w:r>
+      <w:bookmarkEnd w:id="6"/>
+      <w:r>
+        <w:t>а на системата</w:t>
+      </w:r>
+      <w:bookmarkEnd w:id="7"/>
+    </w:p>
+    <w:p>
+      <w:r>
+        <w:rPr>
+          <w:noProof/>
+        </w:rPr>
+        <w:pict w14:anchorId="06990D9E">
+          <v:rect id="_x0000_s1031" style="position:absolute;left:0;text-align:left;margin-left:363.5pt;margin-top:38.3pt;width:123pt;height:70pt;z-index:251663360" fillcolor="#666 [1936]" strokecolor="black [3200]" strokeweight="1pt">
+            <v:fill color2="black [3200]" focus="50%" type="gradient"/>
+            <v:shadow on="t" type="perspective" color="#7f7f7f [1601]" offset="1pt" offset2="-3pt"/>
+            <v:textbox>
+              <w:txbxContent>
+                <w:p>
+                  <w:pPr>
+                    <w:jc w:val="center"/>
+                    <w:rPr>
+                      <w:color w:val="FFFFFF" w:themeColor="background1"/>
+                      <w:lang w:val="en-US"/>
+                    </w:rPr>
+                  </w:pPr>
+                  <w:r>
+                    <w:rPr>
+                      <w:color w:val="FFFFFF" w:themeColor="background1"/>
+                      <w:lang w:val="en-US"/>
+                    </w:rPr>
+                    <w:br/>
+                  </w:r>
+                  <w:proofErr w:type="spellStart"/>
+                  <w:r>
+                    <w:rPr>
+                      <w:color w:val="FFFFFF" w:themeColor="background1"/>
+                      <w:lang w:val="en-US"/>
+                    </w:rPr>
+                    <w:t>libpst</w:t>
+                  </w:r>
+                  <w:proofErr w:type="spellEnd"/>
+                  <w:r>
+                    <w:rPr>
+                      <w:color w:val="FFFFFF" w:themeColor="background1"/>
+                      <w:lang w:val="en-US"/>
+                    </w:rPr>
+                    <w:t xml:space="preserve"> (</w:t>
+                  </w:r>
+                  <w:proofErr w:type="spellStart"/>
+                  <w:r>
+                    <w:rPr>
+                      <w:color w:val="FFFFFF" w:themeColor="background1"/>
+                      <w:lang w:val="en-US"/>
+                    </w:rPr>
+                    <w:t>readpst</w:t>
+                  </w:r>
+                  <w:proofErr w:type="spellEnd"/>
+                  <w:r>
+                    <w:rPr>
+                      <w:color w:val="FFFFFF" w:themeColor="background1"/>
+                      <w:lang w:val="en-US"/>
+                    </w:rPr>
+                    <w:t>)</w:t>
+                  </w:r>
+                </w:p>
+              </w:txbxContent>
+            </v:textbox>
+          </v:rect>
+        </w:pict>
+      </w:r>
+      <w:r>
+        <w:rPr>
+          <w:noProof/>
+        </w:rPr>
+        <w:pict w14:anchorId="06990D9E">
+          <v:rect id="_x0000_s1029" style="position:absolute;left:0;text-align:left;margin-left:180.5pt;margin-top:39.3pt;width:123pt;height:70pt;z-index:251661312" fillcolor="#666 [1936]" strokecolor="black [3200]" strokeweight="1pt">
+            <v:fill color2="black [3200]" focus="50%" type="gradient"/>
+            <v:shadow on="t" type="perspective" color="#7f7f7f [1601]" offset="1pt" offset2="-3pt"/>
+            <v:textbox>
+              <w:txbxContent>
+                <w:p>
+                  <w:pPr>
+                    <w:jc w:val="center"/>
+                    <w:rPr>
+                      <w:color w:val="FFFFFF" w:themeColor="background1"/>
+                      <w:lang w:val="en-US"/>
+                    </w:rPr>
+                  </w:pPr>
+                  <w:r>
+                    <w:rPr>
+                      <w:color w:val="FFFFFF" w:themeColor="background1"/>
+                      <w:lang w:val="en-US"/>
+                    </w:rPr>
+                    <w:br/>
+                  </w:r>
+                  <w:r>
+                    <w:rPr>
+                      <w:color w:val="FFFFFF" w:themeColor="background1"/>
+                      <w:lang w:val="en-US"/>
+                    </w:rPr>
+                    <w:t>WSL Ubuntu</w:t>
+                  </w:r>
+                </w:p>
+              </w:txbxContent>
+            </v:textbox>
+          </v:rect>
+        </w:pict>
+      </w:r>
+      <w:r>
+        <w:rPr>
+          <w:noProof/>
+        </w:rPr>
+        <w:pict w14:anchorId="06990D9E">
+          <v:rect id="_x0000_s1026" style="position:absolute;left:0;text-align:left;margin-left:0;margin-top:40.3pt;width:123pt;height:70pt;z-index:251659264" fillcolor="#666 [1936]" strokecolor="black [3200]" strokeweight="1pt">
+            <v:fill color2="black [3200]" focus="50%" type="gradient"/>
+            <v:shadow on="t" type="perspective" color="#7f7f7f [1601]" offset="1pt" offset2="-3pt"/>
+            <v:textbox>
+              <w:txbxContent>
+                <w:p>
+                  <w:pPr>
+                    <w:jc w:val="center"/>
+                    <w:rPr>
+                      <w:color w:val="FFFFFF" w:themeColor="background1"/>
+                      <w:lang w:val="en-US"/>
+                    </w:rPr>
+                  </w:pPr>
+                  <w:r>
+                    <w:rPr>
+                      <w:color w:val="FFFFFF" w:themeColor="background1"/>
+                      <w:lang w:val="en-US"/>
+                    </w:rPr>
+                    <w:br/>
+                  </w:r>
+                  <w:r>
+                    <w:rPr>
+                      <w:color w:val="FFFFFF" w:themeColor="background1"/>
+                      <w:lang w:val="en-US"/>
+                    </w:rPr>
+                    <w:t>Windows FS</w:t>
+                  </w:r>
+                  <w:r>
+                    <w:rPr>
+                      <w:color w:val="FFFFFF" w:themeColor="background1"/>
+                      <w:lang w:val="en-US"/>
+                    </w:rPr>
+                    <w:br/>
+                    <w:t>(backup.pst)</w:t>
+                  </w:r>
+                </w:p>
+              </w:txbxContent>
+            </v:textbox>
+          </v:rect>
+        </w:pict>
+      </w:r>
+      <w:r>
+        <w:t>Следната диаграма илюстрира пълния процес на обработка на данни от въвеждане на PST файлове до чист CSV изход:</w:t>
+      </w:r>
+    </w:p>
+    <w:p>
+      <w:pPr>
+        <w:pStyle w:val="Caption"/>
+      </w:pPr>
+      <w:r>
+        <w:rPr>
+          <w:noProof/>
+        </w:rPr>
+        <w:pict w14:anchorId="58E3FEED">
+          <v:shapetype id="_x0000_t32" coordsize="21600,21600" o:spt="32" o:oned="t" path="m,l21600,21600e" filled="f">
+            <v:path arrowok="t" fillok="f" o:connecttype="none"/>
+            <o:lock v:ext="edit" shapetype="t"/>
+          </v:shapetype>
+          <v:shape id="_x0000_s1030" type="#_x0000_t32" style="position:absolute;left:0;text-align:left;margin-left:305pt;margin-top:28.4pt;width:58.5pt;height:0;z-index:251662336" o:connectortype="straight">
+            <v:stroke endarrow="block"/>
+          </v:shape>
+        </w:pict>
+      </w:r>
+      <w:r>
+        <w:rPr>
+          <w:noProof/>
+        </w:rPr>
+        <w:pict w14:anchorId="58E3FEED">
+          <v:shape id="_x0000_s1028" type="#_x0000_t32" style="position:absolute;left:0;text-align:left;margin-left:121.5pt;margin-top:28.4pt;width:58.5pt;height:0;z-index:251660288" o:connectortype="straight">
+            <v:stroke endarrow="block"/>
+          </v:shape>
+        </w:pict>
+      </w:r>
+    </w:p>
+    <w:p>
+      <w:pPr>
+        <w:pStyle w:val="Caption"/>
+      </w:pPr>
+      <w:r>
+        <w:rPr>
+          <w:noProof/>
+        </w:rPr>
+        <w:pict w14:anchorId="58E3FEED">
+          <v:shape id="_x0000_s1032" type="#_x0000_t32" style="position:absolute;left:0;text-align:left;margin-left:56pt;margin-top:30pt;width:369pt;height:42pt;flip:x;z-index:251664384" o:connectortype="straight">
+            <v:stroke endarrow="block"/>
+          </v:shape>
+        </w:pict>
+      </w:r>
+    </w:p>
+    <w:p>
+      <w:pPr>
+        <w:pStyle w:val="Caption"/>
+      </w:pPr>
+    </w:p>
+    <w:p>
+      <w:pPr>
+        <w:pStyle w:val="Caption"/>
+      </w:pPr>
+      <w:r>
+        <w:rPr>
+          <w:noProof/>
+          <w:lang w:val="en-US"/>
+        </w:rPr>
+        <w:pict w14:anchorId="06990D9E">
+          <v:rect id="_x0000_s1037" style="position:absolute;left:0;text-align:left;margin-left:358.5pt;margin-top:6.1pt;width:123pt;height:70pt;z-index:251669504" fillcolor="#666 [1936]" strokecolor="black [3200]" strokeweight="1pt">
+            <v:fill color2="black [3200]" focus="50%" type="gradient"/>
+            <v:shadow on="t" type="perspective" color="#7f7f7f [1601]" offset="1pt" offset2="-3pt"/>
+            <v:textbox>
+              <w:txbxContent>
+                <w:p>
+                  <w:pPr>
+                    <w:jc w:val="center"/>
+                    <w:rPr>
+                      <w:color w:val="FFFFFF" w:themeColor="background1"/>
+                      <w:lang w:val="en-US"/>
+                    </w:rPr>
+                  </w:pPr>
+                  <w:r>
+                    <w:rPr>
+                      <w:color w:val="FFFFFF" w:themeColor="background1"/>
+                      <w:lang w:val="en-US"/>
+                    </w:rPr>
+                    <w:br/>
+                    <w:t>addresses_clean.csv</w:t>
+                  </w:r>
+                </w:p>
+              </w:txbxContent>
+            </v:textbox>
+          </v:rect>
+        </w:pict>
+      </w:r>
+      <w:r>
+        <w:rPr>
+          <w:noProof/>
+          <w:lang w:val="en-US"/>
+        </w:rPr>
+        <w:pict w14:anchorId="06990D9E">
+          <v:rect id="_x0000_s1035" style="position:absolute;left:0;text-align:left;margin-left:178.5pt;margin-top:7.6pt;width:123pt;height:70pt;z-index:251667456" fillcolor="#666 [1936]" strokecolor="black [3200]" strokeweight="1pt">
+            <v:fill color2="black [3200]" focus="50%" type="gradient"/>
+            <v:shadow on="t" type="perspective" color="#7f7f7f [1601]" offset="1pt" offset2="-3pt"/>
+            <v:textbox>
+              <w:txbxContent>
+                <w:p>
+                  <w:pPr>
+                    <w:jc w:val="center"/>
+                    <w:rPr>
+                      <w:color w:val="FFFFFF" w:themeColor="background1"/>
+                      <w:lang w:val="en-US"/>
+                    </w:rPr>
+                  </w:pPr>
+                  <w:r>
+                    <w:rPr>
+                      <w:color w:val="FFFFFF" w:themeColor="background1"/>
+                      <w:lang w:val="en-US"/>
+                    </w:rPr>
+                    <w:t>main.py</w:t>
+                  </w:r>
+                  <w:r>
+                    <w:rPr>
+                      <w:color w:val="FFFFFF" w:themeColor="background1"/>
+                      <w:lang w:val="en-US"/>
+                    </w:rPr>
+                    <w:br/>
+                    <w:t>(creates object and calls methods)</w:t>
+                  </w:r>
+                </w:p>
+              </w:txbxContent>
+            </v:textbox>
+          </v:rect>
+        </w:pict>
+      </w:r>
+      <w:r>
+        <w:rPr>
+          <w:noProof/>
+          <w:lang w:val="en-US"/>
+        </w:rPr>
+        <w:pict w14:anchorId="58E3FEED">
+          <v:shape id="_x0000_s1034" type="#_x0000_t32" style="position:absolute;left:0;text-align:left;margin-left:119.5pt;margin-top:42.1pt;width:58.5pt;height:0;z-index:251666432" o:connectortype="straight">
+            <v:stroke endarrow="block"/>
+          </v:shape>
+        </w:pict>
+      </w:r>
+      <w:r>
+        <w:rPr>
+          <w:noProof/>
+          <w:lang w:val="en-US"/>
+        </w:rPr>
+        <w:pict w14:anchorId="06990D9E">
+          <v:rect id="_x0000_s1033" style="position:absolute;left:0;text-align:left;margin-left:-2pt;margin-top:8.1pt;width:123pt;height:70pt;z-index:251665408" fillcolor="#666 [1936]" strokecolor="black [3200]" strokeweight="1pt">
+            <v:fill color2="black [3200]" focus="50%" type="gradient"/>
+            <v:shadow on="t" type="perspective" color="#7f7f7f [1601]" offset="1pt" offset2="-3pt"/>
+            <v:textbox>
+              <w:txbxContent>
+                <w:p>
+                  <w:pPr>
+                    <w:jc w:val="center"/>
+                    <w:rPr>
+                      <w:color w:val="FFFFFF" w:themeColor="background1"/>
+                      <w:lang w:val="en-US"/>
+                    </w:rPr>
+                  </w:pPr>
+                  <w:r>
+                    <w:rPr>
+                      <w:color w:val="FFFFFF" w:themeColor="background1"/>
+                      <w:lang w:val="en-US"/>
+                    </w:rPr>
+                    <w:br/>
+                  </w:r>
+                  <w:proofErr w:type="spellStart"/>
+                  <w:r>
+                    <w:rPr>
+                      <w:color w:val="FFFFFF" w:themeColor="background1"/>
+                      <w:lang w:val="en-US"/>
+                    </w:rPr>
+                    <w:t>EmailProcessor</w:t>
+                  </w:r>
+                  <w:proofErr w:type="spellEnd"/>
+                  <w:r>
+                    <w:rPr>
+                      <w:color w:val="FFFFFF" w:themeColor="background1"/>
+                      <w:lang w:val="en-US"/>
+                    </w:rPr>
+                    <w:br/>
+                    <w:t>(class)</w:t>
+                  </w:r>
+                </w:p>
+              </w:txbxContent>
+            </v:textbox>
+          </v:rect>
+        </w:pict>
+      </w:r>
+    </w:p>
+    <w:p>
+      <w:pPr>
+        <w:pStyle w:val="Caption"/>
+        <w:rPr>
+          <w:lang w:val="en-US"/>
+        </w:rPr>
+      </w:pPr>
+      <w:r>
+        <w:rPr>
+          <w:noProof/>
+          <w:lang w:val="en-US"/>
+        </w:rPr>
+        <w:pict w14:anchorId="58E3FEED">
+          <v:shape id="_x0000_s1036" type="#_x0000_t32" style="position:absolute;left:0;text-align:left;margin-left:300pt;margin-top:8.65pt;width:58.5pt;height:0;z-index:251668480" o:connectortype="straight">
+            <v:stroke endarrow="block"/>
+          </v:shape>
+        </w:pict>
+      </w:r>
+    </w:p>
+    <w:p>
+      <w:pPr>
+        <w:pStyle w:val="Caption"/>
+        <w:jc w:val="both"/>
+        <w:rPr>
+          <w:lang w:val="en-US"/>
+        </w:rPr>
+      </w:pPr>
+    </w:p>
+    <w:p>
+      <w:pPr>
+        <w:pStyle w:val="Caption"/>
+      </w:pPr>
+      <w:r>
+        <w:t>Фигура 1: Преглед на системната архитектура</w:t>
+      </w:r>
+    </w:p>
+    <w:p>
+      <w:pPr>
+        <w:pStyle w:val="Heading1"/>
+      </w:pPr>
+      <w:bookmarkStart w:id="8" w:name="_Toc003"/>
+      <w:bookmarkStart w:id="9" w:name="_Toc231064311"/>
+      <w:r>
+        <w:lastRenderedPageBreak/>
+        <w:t>3. Настройка на средата (WSL конфигурация)</w:t>
+      </w:r>
+      <w:bookmarkEnd w:id="8"/>
+      <w:bookmarkEnd w:id="9"/>
     </w:p>
     <w:p>
       <w:pPr>
         <w:pStyle w:val="Heading2"/>
       </w:pPr>
-      <w:bookmarkStart w:id="15" w:name="_Toc224899401"/>
-      <w:r>
-        <w:t xml:space="preserve">4.2 Фаза 2: Модул за </w:t>
-      </w:r>
-      <w:r>
-        <w:t>санитизиране</w:t>
-      </w:r>
-      <w:r>
-        <w:t xml:space="preserve"> на данни (filter_emails.py)</w:t>
+      <w:bookmarkStart w:id="10" w:name="_Toc231064312"/>
+      <w:r>
+        <w:t>3.1 Инсталация</w:t>
+      </w:r>
+      <w:bookmarkEnd w:id="10"/>
+    </w:p>
+    <w:p>
+      <w:r>
+        <w:t xml:space="preserve">Изпълнение в </w:t>
+      </w:r>
+      <w:r>
+        <w:rPr>
+          <w:lang w:val="en-US"/>
+        </w:rPr>
+        <w:t>elevated</w:t>
+      </w:r>
+      <w:r>
+        <w:t xml:space="preserve"> PowerShell</w:t>
+      </w:r>
+      <w:r>
+        <w:rPr>
+          <w:lang w:val="en-US"/>
+        </w:rPr>
+        <w:t xml:space="preserve"> (</w:t>
+      </w:r>
+      <w:r>
+        <w:t>администраторски достъп</w:t>
+      </w:r>
+      <w:r>
+        <w:rPr>
+          <w:lang w:val="en-US"/>
+        </w:rPr>
+        <w:t>)</w:t>
+      </w:r>
+      <w:r>
+        <w:t>:</w:t>
+      </w:r>
+    </w:p>
+    <w:p>
+      <w:pPr>
+        <w:pStyle w:val="Code"/>
+      </w:pPr>
+      <w:r>
+        <w:t>wsl --install -d Ubuntu</w:t>
+      </w:r>
+    </w:p>
+    <w:p>
+      <w:pPr>
+        <w:spacing w:before="120"/>
+      </w:pPr>
+      <w:r>
+        <w:rPr>
+          <w:i/>
+          <w:color w:val="4A5568"/>
+        </w:rPr>
+        <w:t>Забележка: Необходимо е рестартиране на системата, за да се активират функциите на Virtual Machine Platform.</w:t>
+      </w:r>
+    </w:p>
+    <w:p>
+      <w:pPr>
+        <w:pStyle w:val="Heading2"/>
+      </w:pPr>
+      <w:bookmarkStart w:id="11" w:name="_Toc231064313"/>
+      <w:r>
+        <w:t>3.2 Разрешаване на зависимости</w:t>
+      </w:r>
+      <w:bookmarkEnd w:id="11"/>
+    </w:p>
+    <w:p>
+      <w:r>
+        <w:t xml:space="preserve">Отворете терминала на Ubuntu и обновете хранилища за пакети (критично за предотвратяване на </w:t>
+      </w:r>
+      <w:r>
+        <w:t>грешки тип „E: Unable to locate package“</w:t>
+      </w:r>
+      <w:r>
+        <w:t>):</w:t>
+      </w:r>
+    </w:p>
+    <w:p>
+      <w:pPr>
+        <w:pStyle w:val="Code"/>
+      </w:pPr>
+      <w:r>
+        <w:t>sudo apt-get update</w:t>
+      </w:r>
+    </w:p>
+    <w:p>
+      <w:pPr>
+        <w:pStyle w:val="Code"/>
+      </w:pPr>
+      <w:r>
+        <w:t>sudo apt-get install software-properties-common -y</w:t>
+      </w:r>
+    </w:p>
+    <w:p>
+      <w:pPr>
+        <w:pStyle w:val="Code"/>
+      </w:pPr>
+      <w:r>
+        <w:t>sudo add-apt-repository universe -y</w:t>
+      </w:r>
+    </w:p>
+    <w:p>
+      <w:pPr>
+        <w:pStyle w:val="Code"/>
+      </w:pPr>
+      <w:r>
+        <w:t>sudo apt-get update</w:t>
+      </w:r>
+    </w:p>
+    <w:p>
+      <w:pPr>
+        <w:pStyle w:val="Code"/>
+      </w:pPr>
+      <w:r>
+        <w:t>sudo apt-get install libpst-tools python3 -y</w:t>
+      </w:r>
+    </w:p>
+    <w:p>
+      <w:r>
+        <w:t>Проверка:</w:t>
+      </w:r>
+    </w:p>
+    <w:p>
+      <w:pPr>
+        <w:pStyle w:val="Code"/>
+      </w:pPr>
+      <w:r>
+        <w:t xml:space="preserve">readpst -V # Трябва да </w:t>
+      </w:r>
+      <w:r>
+        <w:t>изведе</w:t>
+      </w:r>
+      <w:r>
+        <w:t xml:space="preserve"> информация за версията на libpst</w:t>
+      </w:r>
+    </w:p>
+    <w:p>
+      <w:pPr>
+        <w:pStyle w:val="Heading1"/>
+      </w:pPr>
+      <w:bookmarkStart w:id="12" w:name="_Toc004"/>
+      <w:bookmarkStart w:id="13" w:name="_Toc231064314"/>
+      <w:r>
+        <w:lastRenderedPageBreak/>
+        <w:t>4. Реализация</w:t>
+      </w:r>
+      <w:bookmarkEnd w:id="12"/>
+      <w:bookmarkEnd w:id="13"/>
+    </w:p>
+    <w:p>
+      <w:pPr>
+        <w:pStyle w:val="Heading2"/>
+        <w:rPr>
+          <w:lang w:val="en-US"/>
+        </w:rPr>
+      </w:pPr>
+      <w:bookmarkStart w:id="14" w:name="_Toc231064315"/>
+      <w:r>
+        <w:t xml:space="preserve">4.1 Модул </w:t>
+      </w:r>
+      <w:r>
+        <w:t xml:space="preserve">с бизнес логика </w:t>
+      </w:r>
+      <w:r>
+        <w:rPr>
+          <w:lang w:val="en-US"/>
+        </w:rPr>
+        <w:t>(main.py)</w:t>
+      </w:r>
+      <w:bookmarkEnd w:id="14"/>
+    </w:p>
+    <w:p>
+      <w:pPr>
+        <w:pStyle w:val="Heading2"/>
+        <w:rPr>
+          <w:b w:val="0"/>
+          <w:sz w:val="24"/>
+          <w:lang w:val="en-US"/>
+        </w:rPr>
+      </w:pPr>
+      <w:bookmarkStart w:id="15" w:name="_Toc231064316"/>
+      <w:r>
+        <w:rPr>
+          <w:b w:val="0"/>
+          <w:sz w:val="24"/>
+        </w:rPr>
+        <w:t>В този файл е дефиниран класът EmailProcessor, който инкапсулира цялата логика за обработка на данни. Класът притежава конструктор и четири метода, които покриват пълния жизнен цикъл на данните:</w:t>
       </w:r>
       <w:bookmarkEnd w:id="15"/>
     </w:p>
     <w:p>
-      <w:r>
-        <w:t xml:space="preserve">Прилага евристики за разграничаване на човешки </w:t>
-      </w:r>
-      <w:r>
-        <w:t>адреси</w:t>
-      </w:r>
-      <w:r>
-        <w:t xml:space="preserve"> от инфраструктурни адреси, често срещани в Exchange Online (Microsoft 365) среди.</w:t>
-      </w:r>
-    </w:p>
-    <w:p>
-      <w:pPr>
-        <w:spacing w:before="200"/>
-      </w:pPr>
-      <w:r>
-        <w:rPr>
-          <w:b/>
-        </w:rPr>
-        <w:t>Класификационна логика:</w:t>
-      </w:r>
-    </w:p>
-    <w:p>
-      <w:pPr>
-        <w:numPr>
-          <w:ilvl w:val="0"/>
-          <w:numId w:val="2"/>
-        </w:numPr>
-      </w:pPr>
-      <w:r>
-        <w:t>Microsoft Transport Servers: Pattern vi1pr02mb6061...eurprd02.prod.outlook.com идентифицира вътрешното маршрутизиране на сървъра за пощенска кутия на Exchange Online</w:t>
-      </w:r>
-    </w:p>
-    <w:p>
-      <w:pPr>
-        <w:numPr>
-          <w:ilvl w:val="0"/>
-          <w:numId w:val="2"/>
-        </w:numPr>
-      </w:pPr>
-      <w:r>
-        <w:t>Системни пощенски кутии: Стандартни RFC 2142 адреси (</w:t>
-      </w:r>
-      <w:r>
-        <w:t>postmaster, hostmaster, и т</w:t>
-      </w:r>
-      <w:r>
-        <w:t>.</w:t>
-      </w:r>
-      <w:r>
-        <w:t>н.</w:t>
-      </w:r>
-      <w:r>
-        <w:t>)</w:t>
-      </w:r>
-    </w:p>
-    <w:p>
-      <w:pPr>
-        <w:numPr>
-          <w:ilvl w:val="0"/>
-          <w:numId w:val="2"/>
-        </w:numPr>
-      </w:pPr>
-      <w:r>
-        <w:t>Автоматизирани хеш идентификатори: 32+ символни шестнадесетични низове, типични за обработка на SRS bounce</w:t>
-      </w:r>
-    </w:p>
-    <w:p>
-      <w:pPr>
-        <w:numPr>
-          <w:ilvl w:val="0"/>
-          <w:numId w:val="2"/>
-        </w:numPr>
-      </w:pPr>
-      <w:r>
-        <w:t>Вътрешни поддомейни: *.protection.outlook.com</w:t>
-      </w:r>
-      <w:r>
-        <w:t>, *</w:t>
-      </w:r>
-      <w:r>
-        <w:rPr>
+      <w:pPr>
+        <w:pStyle w:val="Heading2"/>
+        <w:rPr>
+          <w:bCs/>
+          <w:sz w:val="24"/>
           <w:lang w:val="en-US"/>
         </w:rPr>
-        <w:t>mail.gmail.com</w:t>
-      </w:r>
-      <w:r>
-        <w:t xml:space="preserve"> (EOP филтриращи агенти)</w:t>
-      </w:r>
+      </w:pPr>
+      <w:bookmarkStart w:id="16" w:name="_Toc231064317"/>
+      <w:r>
+        <w:rPr>
+          <w:bCs/>
+          <w:sz w:val="24"/>
+        </w:rPr>
+        <w:t>• __init__(self, pst_path, output_dir=".")</w:t>
+      </w:r>
+      <w:bookmarkEnd w:id="16"/>
+    </w:p>
+    <w:p>
+      <w:pPr>
+        <w:pStyle w:val="Heading2"/>
+        <w:rPr>
+          <w:b w:val="0"/>
+          <w:sz w:val="24"/>
+          <w:lang w:val="en-US"/>
+        </w:rPr>
+      </w:pPr>
+      <w:bookmarkStart w:id="17" w:name="_Toc231064318"/>
+      <w:r>
+        <w:rPr>
+          <w:b w:val="0"/>
+          <w:sz w:val="24"/>
+        </w:rPr>
+        <w:t>Конструкторът приема път към PST файл и изходна директория. Инициализира вътрешни атрибути self.raw_emails (списък) и self.clean_emails (списък), които служат за временно съхранение на извлечените адреси преди и след филтриране.</w:t>
+      </w:r>
+      <w:bookmarkEnd w:id="17"/>
+    </w:p>
+    <w:p>
+      <w:pPr>
+        <w:pStyle w:val="Heading2"/>
+        <w:rPr>
+          <w:bCs/>
+          <w:sz w:val="24"/>
+          <w:lang w:val="en-US"/>
+        </w:rPr>
+      </w:pPr>
+      <w:bookmarkStart w:id="18" w:name="_Toc231064319"/>
+      <w:r>
+        <w:rPr>
+          <w:bCs/>
+          <w:sz w:val="24"/>
+        </w:rPr>
+        <w:t>• extract_from_pst(self)</w:t>
+      </w:r>
+      <w:bookmarkEnd w:id="18"/>
+    </w:p>
+    <w:p>
+      <w:pPr>
+        <w:pStyle w:val="Heading2"/>
+        <w:rPr>
+          <w:b w:val="0"/>
+          <w:sz w:val="24"/>
+          <w:lang w:val="en-US"/>
+        </w:rPr>
+      </w:pPr>
+      <w:bookmarkStart w:id="19" w:name="_Toc231064320"/>
+      <w:r>
+        <w:rPr>
+          <w:b w:val="0"/>
+          <w:sz w:val="24"/>
+        </w:rPr>
+        <w:t>Извлича имейл адреси от двоичния PST архив чрез извикване на външния инструмент readpst във временна директория (tempfile.mkdtemp). След разопаковането на съобщенията, методът обхожда извлечените файлове в цикъл for root, dirs, files in os.walk(...). За всеки файл отваря съдържанието, прилага regex шаблон и използва условен израз за валидация на валидни SMTP адреси. Намерените адреси се добавят в self.raw_emails. Временната директория се изтрива автоматично в finally блок, независимо от изхода на операцията.</w:t>
+      </w:r>
+      <w:bookmarkEnd w:id="19"/>
+    </w:p>
+    <w:p>
+      <w:pPr>
+        <w:pStyle w:val="Heading2"/>
+        <w:rPr>
+          <w:bCs/>
+          <w:sz w:val="24"/>
+          <w:lang w:val="en-US"/>
+        </w:rPr>
+      </w:pPr>
+      <w:bookmarkStart w:id="20" w:name="_Toc231064321"/>
+      <w:r>
+        <w:rPr>
+          <w:bCs/>
+          <w:sz w:val="24"/>
+        </w:rPr>
+        <w:t>• filter_and_sort(self)</w:t>
+      </w:r>
+      <w:bookmarkEnd w:id="20"/>
+    </w:p>
+    <w:p>
+      <w:pPr>
+        <w:pStyle w:val="Heading2"/>
+        <w:rPr>
+          <w:b w:val="0"/>
+          <w:sz w:val="24"/>
+          <w:lang w:val="en-US"/>
+        </w:rPr>
+      </w:pPr>
+      <w:bookmarkStart w:id="21" w:name="_Toc231064322"/>
+      <w:r>
+        <w:rPr>
+          <w:b w:val="0"/>
+          <w:sz w:val="24"/>
+        </w:rPr>
+        <w:t>Филтрира системните и инфраструктурните имейл адреси, които са характерни за Exchange Online среди. Методът използва списък от regex шаблони (exclude_patterns), които се прилагат в условни проверки чрез цикъл for pattern in exclude_patterns. Адресите, които не съвпадат с нито един шаблон, се запазват в множество (set) за дедупликация с константна сложност O(1). След филтрирането списъкът self.clean_emails се сортира по азбучен ред чрез вградения метод .sort().</w:t>
+      </w:r>
+      <w:bookmarkEnd w:id="21"/>
+    </w:p>
+    <w:p>
+      <w:pPr>
+        <w:pStyle w:val="Heading2"/>
+        <w:rPr>
+          <w:bCs/>
+          <w:sz w:val="24"/>
+          <w:lang w:val="en-US"/>
+        </w:rPr>
+      </w:pPr>
+      <w:bookmarkStart w:id="22" w:name="_Toc231064323"/>
+      <w:r>
+        <w:rPr>
+          <w:bCs/>
+          <w:sz w:val="24"/>
+        </w:rPr>
+        <w:t>• save_to_csv(self, filename)</w:t>
+      </w:r>
+      <w:bookmarkEnd w:id="22"/>
+    </w:p>
+    <w:p>
+      <w:pPr>
+        <w:pStyle w:val="Heading2"/>
+        <w:rPr>
+          <w:b w:val="0"/>
+          <w:sz w:val="24"/>
+          <w:lang w:val="en-US"/>
+        </w:rPr>
+      </w:pPr>
+      <w:bookmarkStart w:id="23" w:name="_Toc231064324"/>
+      <w:r>
+        <w:rPr>
+          <w:b w:val="0"/>
+          <w:sz w:val="24"/>
+        </w:rPr>
+        <w:lastRenderedPageBreak/>
+        <w:t>Записва обработените и сортирани данни в стандартизиран CSV формат с колона email_address. Използва се модулът csv с параметър newline='' за коректна обработка на редове в Windows/Linux среди.</w:t>
+      </w:r>
+      <w:bookmarkEnd w:id="23"/>
+    </w:p>
+    <w:p>
+      <w:pPr>
+        <w:pStyle w:val="Heading2"/>
+        <w:rPr>
+          <w:bCs/>
+          <w:sz w:val="24"/>
+          <w:lang w:val="en-US"/>
+        </w:rPr>
+      </w:pPr>
+      <w:bookmarkStart w:id="24" w:name="_Toc231064325"/>
+      <w:r>
+        <w:rPr>
+          <w:bCs/>
+          <w:sz w:val="24"/>
+        </w:rPr>
+        <w:t>• get_stats(self)</w:t>
+      </w:r>
+      <w:bookmarkEnd w:id="24"/>
+    </w:p>
+    <w:p>
+      <w:pPr>
+        <w:pStyle w:val="Heading2"/>
+        <w:rPr>
+          <w:b w:val="0"/>
+          <w:sz w:val="24"/>
+          <w:lang w:val="en-US"/>
+        </w:rPr>
+      </w:pPr>
+      <w:bookmarkStart w:id="25" w:name="_Toc231064326"/>
+      <w:r>
+        <w:rPr>
+          <w:b w:val="0"/>
+          <w:sz w:val="24"/>
+        </w:rPr>
+        <w:t>Връща речник (dict) с метрики: брой raw записи и брой уникални чисти записи. Методът е полезен за верификация и анализ на качеството на данните след обработка.</w:t>
+      </w:r>
+      <w:bookmarkEnd w:id="25"/>
+    </w:p>
+    <w:p>
+      <w:pPr>
+        <w:pStyle w:val="Heading2"/>
+      </w:pPr>
+      <w:bookmarkStart w:id="26" w:name="_Toc231064327"/>
+      <w:r>
+        <w:t xml:space="preserve">4.2 </w:t>
+      </w:r>
+      <w:r>
+        <w:t>Главен модул за изпълнение</w:t>
+      </w:r>
+      <w:r>
+        <w:t xml:space="preserve"> (</w:t>
+      </w:r>
+      <w:r>
+        <w:rPr>
+          <w:lang w:val="en-US"/>
+        </w:rPr>
+        <w:t>main</w:t>
+      </w:r>
+      <w:r>
+        <w:t>.py)</w:t>
+      </w:r>
+      <w:bookmarkStart w:id="27" w:name="_Toc005"/>
+      <w:bookmarkEnd w:id="26"/>
+    </w:p>
+    <w:p>
+      <w:pPr>
+        <w:pStyle w:val="Heading2"/>
+        <w:rPr>
+          <w:b w:val="0"/>
+          <w:sz w:val="24"/>
+        </w:rPr>
+      </w:pPr>
+      <w:bookmarkStart w:id="28" w:name="_Toc231064328"/>
+      <w:r>
+        <w:rPr>
+          <w:b w:val="0"/>
+          <w:sz w:val="24"/>
+        </w:rPr>
+        <w:t>Точка на вход в приложението. Модулът импортира класа EmailProcessor от models.py, чете аргументите от командния ред чрез sys.argv, създава обект от класа с подадените параметри и последователно извиква неговите методи за изпълнение на конкретната задача по обработка и сортиране на данните.</w:t>
+      </w:r>
+      <w:bookmarkEnd w:id="28"/>
     </w:p>
     <w:p>
       <w:pPr>
         <w:pStyle w:val="Heading1"/>
       </w:pPr>
-      <w:bookmarkStart w:id="16" w:name="_Toc005"/>
-      <w:bookmarkStart w:id="17" w:name="_Toc224899402"/>
+      <w:bookmarkStart w:id="29" w:name="_Toc231064329"/>
       <w:r>
         <w:lastRenderedPageBreak/>
         <w:t>5. Работен процес на изпълнение</w:t>
       </w:r>
-      <w:bookmarkEnd w:id="16"/>
-      <w:bookmarkEnd w:id="17"/>
+      <w:bookmarkEnd w:id="27"/>
+      <w:bookmarkEnd w:id="29"/>
     </w:p>
     <w:p>
       <w:pPr>
         <w:pStyle w:val="Heading2"/>
       </w:pPr>
-      <w:bookmarkStart w:id="18" w:name="_Toc224899403"/>
+      <w:bookmarkStart w:id="30" w:name="_Toc231064330"/>
       <w:r>
         <w:t>5.1 Разположение на файловете</w:t>
       </w:r>
-      <w:bookmarkEnd w:id="18"/>
+      <w:bookmarkEnd w:id="30"/>
     </w:p>
     <w:p>
       <w:r>
@@ -2682,7 +2762,22 @@
         </w:rPr>
       </w:pPr>
       <w:r>
-        <w:t>cd /mnt/c/Users/[USERNAME]/Documents/pst_analysis</w:t>
+        <w:t>cd /mnt/c/Users/[USERNAME]/</w:t>
+      </w:r>
+      <w:r>
+        <w:rPr>
+          <w:lang w:val="en-US"/>
+        </w:rPr>
+        <w:t>Downloads</w:t>
+      </w:r>
+      <w:r>
+        <w:t>/</w:t>
+      </w:r>
+      <w:r>
+        <w:rPr>
+          <w:lang w:val="en-US"/>
+        </w:rPr>
+        <w:t>Outlook-Email-Address-Exporter</w:t>
       </w:r>
     </w:p>
     <w:p>
@@ -2693,15 +2788,21 @@
         <w:t xml:space="preserve"># </w:t>
       </w:r>
       <w:r>
-        <w:t>Поставете</w:t>
-      </w:r>
-      <w:r>
-        <w:t xml:space="preserve"> pst_extractor.py, filter_emails.py и </w:t>
+        <w:t xml:space="preserve">В папката трябва да присъстват най-вече </w:t>
       </w:r>
       <w:r>
         <w:rPr>
           <w:lang w:val="en-US"/>
         </w:rPr>
+        <w:t xml:space="preserve">models.py, main.py </w:t>
+      </w:r>
+      <w:r>
+        <w:t xml:space="preserve">и </w:t>
+      </w:r>
+      <w:r>
+        <w:rPr>
+          <w:lang w:val="en-US"/>
+        </w:rPr>
         <w:t>backup</w:t>
       </w:r>
       <w:r>
@@ -2716,38 +2817,37 @@
       </w:r>
       <w:proofErr w:type="spellEnd"/>
       <w:r>
-        <w:t xml:space="preserve"> тук</w:t>
+        <w:t xml:space="preserve"> (експортът от Аутлуук за обработка)</w:t>
       </w:r>
     </w:p>
     <w:p>
       <w:pPr>
         <w:pStyle w:val="Heading2"/>
       </w:pPr>
-      <w:bookmarkStart w:id="19" w:name="_Toc224899404"/>
+      <w:bookmarkStart w:id="31" w:name="_Toc231064331"/>
       <w:r>
         <w:t>5.2 Последователност на изпълнение</w:t>
       </w:r>
-      <w:bookmarkEnd w:id="19"/>
+      <w:bookmarkEnd w:id="31"/>
     </w:p>
     <w:p>
       <w:r>
         <w:rPr>
           <w:b/>
         </w:rPr>
-        <w:t xml:space="preserve">Стъпка 1: Извличане на </w:t>
+        <w:t>Единствена с</w:t>
       </w:r>
       <w:r>
         <w:rPr>
           <w:b/>
-          <w:lang w:val="en-US"/>
-        </w:rPr>
-        <w:t>raw</w:t>
+        </w:rPr>
+        <w:t>тъпка</w:t>
       </w:r>
       <w:r>
         <w:rPr>
           <w:b/>
         </w:rPr>
-        <w:t xml:space="preserve"> данни</w:t>
+        <w:t>: Стартиране на главния модул:</w:t>
       </w:r>
     </w:p>
     <w:p>
@@ -2755,7 +2855,7 @@
         <w:pStyle w:val="Code"/>
       </w:pPr>
       <w:r>
-        <w:t>python3 pst_extractor.py backup.pst addresses_raw.csv</w:t>
+        <w:t>python3 main.py backup.pst addresses_clean.csv</w:t>
       </w:r>
     </w:p>
     <w:p>
@@ -2767,67 +2867,28 @@
           <w:i/>
           <w:color w:val="4A5568"/>
         </w:rPr>
-        <w:t>Очакван резултат: Индикатори за напредък на всеки 1000 съобщения, окончателен брой уникални адреси.</w:t>
-      </w:r>
-    </w:p>
-    <w:p>
-      <w:r>
-        <w:rPr>
-          <w:b/>
-        </w:rPr>
-        <w:t xml:space="preserve">Стъпка 2: </w:t>
-      </w:r>
-      <w:r>
-        <w:rPr>
-          <w:b/>
-        </w:rPr>
-        <w:t>Санитизирайте</w:t>
-      </w:r>
-      <w:r>
-        <w:rPr>
-          <w:b/>
-        </w:rPr>
-        <w:t xml:space="preserve"> набора от данни</w:t>
-      </w:r>
-    </w:p>
-    <w:p>
-      <w:pPr>
-        <w:pStyle w:val="Code"/>
-      </w:pPr>
-      <w:r>
-        <w:rPr>
-          <w:lang w:val="en-US"/>
-        </w:rPr>
-        <w:t>p</w:t>
-      </w:r>
-      <w:r>
-        <w:t>ython3 filter_emails.py addresses_raw.csv addresses_clean.csv</w:t>
-      </w:r>
-    </w:p>
-    <w:p>
-      <w:pPr>
-        <w:spacing w:before="60"/>
-      </w:pPr>
+        <w:t xml:space="preserve">Очакван резултат: </w:t>
+      </w:r>
       <w:r>
         <w:rPr>
           <w:i/>
           <w:color w:val="4A5568"/>
         </w:rPr>
-        <w:t xml:space="preserve">Очакван резултат: Статистически доклад, показващ процент на </w:t>
+        <w:t>Създава се обект от клас EmailProcessor, извличат се адресите от PST файла, филтрират се системните записи</w:t>
       </w:r>
       <w:r>
         <w:rPr>
           <w:i/>
           <w:color w:val="4A5568"/>
         </w:rPr>
-        <w:t>намаляване</w:t>
+        <w:t xml:space="preserve"> </w:t>
       </w:r>
       <w:r>
         <w:rPr>
           <w:i/>
           <w:color w:val="4A5568"/>
         </w:rPr>
-        <w:t xml:space="preserve"> (обикновено 15-40% в </w:t>
+        <w:t xml:space="preserve">(обикновено 15-40% в </w:t>
       </w:r>
       <w:r>
         <w:rPr>
@@ -2842,28 +2903,35 @@
           <w:i/>
           <w:color w:val="4A5568"/>
         </w:rPr>
-        <w:t xml:space="preserve"> среди).</w:t>
+        <w:t xml:space="preserve"> среди)</w:t>
+      </w:r>
+      <w:r>
+        <w:rPr>
+          <w:i/>
+          <w:color w:val="4A5568"/>
+        </w:rPr>
+        <w:t>, сортират се по азбучен ред и се записват в addresses_clean.csv. В конзолата се извежда статистика за броя обработени записи.</w:t>
       </w:r>
     </w:p>
     <w:p>
       <w:pPr>
         <w:pStyle w:val="Heading2"/>
       </w:pPr>
-      <w:bookmarkStart w:id="20" w:name="_Toc224899405"/>
+      <w:bookmarkStart w:id="32" w:name="_Toc231064332"/>
       <w:r>
         <w:t>5.3 Верификация</w:t>
       </w:r>
-      <w:bookmarkEnd w:id="20"/>
+      <w:bookmarkEnd w:id="32"/>
     </w:p>
     <w:p>
       <w:r>
         <w:t xml:space="preserve">Инспектирайте </w:t>
       </w:r>
       <w:r>
-        <w:t>изчистените</w:t>
-      </w:r>
-      <w:r>
-        <w:t xml:space="preserve"> адреси (</w:t>
+        <w:t>изходния файл и статистиката</w:t>
+      </w:r>
+      <w:r>
+        <w:t xml:space="preserve"> (</w:t>
       </w:r>
       <w:r>
         <w:t>опционално дебъгване</w:t>
@@ -2877,45 +2945,48 @@
         <w:pStyle w:val="Code"/>
       </w:pPr>
       <w:r>
-        <w:t xml:space="preserve"># </w:t>
-      </w:r>
-      <w:r>
-        <w:t>Разгледайте</w:t>
-      </w:r>
-      <w:r>
-        <w:t xml:space="preserve"> какво е филтрирано (разлика между файловете)</w:t>
+        <w:t xml:space="preserve">head -20 addresses_clean.csv </w:t>
       </w:r>
     </w:p>
     <w:p>
       <w:pPr>
         <w:pStyle w:val="Code"/>
-      </w:pPr>
-      <w:bookmarkStart w:id="21" w:name="_Toc006"/>
-      <w:bookmarkStart w:id="22" w:name="_Toc224899406"/>
-      <w:r>
-        <w:t>comm -23 &lt;(sort addresses_raw.csv) &lt;(sort addresses_clean.csv) | head -20</w:t>
+        <w:rPr>
+          <w:lang w:val="en-US"/>
+        </w:rPr>
+      </w:pPr>
+      <w:r>
+        <w:t>wc -l addresses_clean.</w:t>
+      </w:r>
+      <w:bookmarkStart w:id="33" w:name="_Toc006"/>
+      <w:r>
+        <w:rPr>
+          <w:lang w:val="en-US"/>
+        </w:rPr>
+        <w:t>csv</w:t>
       </w:r>
     </w:p>
     <w:p>
       <w:pPr>
         <w:pStyle w:val="Heading1"/>
       </w:pPr>
+      <w:bookmarkStart w:id="34" w:name="_Toc231064333"/>
       <w:r>
         <w:lastRenderedPageBreak/>
         <w:t>6. Анализ на резултатите и академичен контекст</w:t>
       </w:r>
-      <w:bookmarkEnd w:id="21"/>
-      <w:bookmarkEnd w:id="22"/>
+      <w:bookmarkEnd w:id="33"/>
+      <w:bookmarkEnd w:id="34"/>
     </w:p>
     <w:p>
       <w:pPr>
         <w:pStyle w:val="Heading2"/>
       </w:pPr>
-      <w:bookmarkStart w:id="23" w:name="_Toc224899407"/>
+      <w:bookmarkStart w:id="35" w:name="_Toc231064334"/>
       <w:r>
         <w:t>6.1 Метрики за качество на данните</w:t>
       </w:r>
-      <w:bookmarkEnd w:id="23"/>
+      <w:bookmarkEnd w:id="35"/>
     </w:p>
     <w:p>
       <w:r>
@@ -2984,11 +3055,17 @@
           <w:numId w:val="4"/>
         </w:numPr>
       </w:pPr>
-      <w:bookmarkStart w:id="24" w:name="_Toc224899408"/>
+      <w:r>
+        <w:rPr>
+          <w:lang w:val="en-US"/>
+        </w:rPr>
+        <w:t xml:space="preserve"> </w:t>
+      </w:r>
+      <w:bookmarkStart w:id="36" w:name="_Toc231064335"/>
       <w:r>
         <w:t>Защо този подход</w:t>
       </w:r>
-      <w:bookmarkEnd w:id="24"/>
+      <w:bookmarkEnd w:id="36"/>
     </w:p>
     <w:p>
       <w:pPr>
@@ -3068,16 +3145,41 @@
     </w:p>
     <w:p>
       <w:pPr>
+        <w:numPr>
+          <w:ilvl w:val="0"/>
+          <w:numId w:val="1"/>
+        </w:numPr>
+      </w:pPr>
+      <w:r>
+        <w:t>Обектно-ориентиран дизайн: Класът EmailProcessor позволява повторна употреба, модулно тестване и лесна поддръжка на кодовата база</w:t>
+      </w:r>
+    </w:p>
+    <w:p>
+      <w:pPr>
+        <w:numPr>
+          <w:ilvl w:val="0"/>
+          <w:numId w:val="1"/>
+        </w:numPr>
+      </w:pPr>
+      <w:r>
+        <w:t>Е</w:t>
+      </w:r>
+      <w:r>
+        <w:t>нкапсулация: Временните директории, regex шаблоните и вътрешните структури са скрити от потребителя; интерфейсът е опростен до няколко публични метода</w:t>
+      </w:r>
+    </w:p>
+    <w:p>
+      <w:pPr>
         <w:pStyle w:val="Heading2"/>
       </w:pPr>
-      <w:bookmarkStart w:id="25" w:name="_Toc224899409"/>
+      <w:bookmarkStart w:id="37" w:name="_Toc231064336"/>
       <w:r>
         <w:t xml:space="preserve">6.3 </w:t>
       </w:r>
-      <w:bookmarkEnd w:id="25"/>
       <w:r>
         <w:t>Лимитации</w:t>
       </w:r>
+      <w:bookmarkEnd w:id="37"/>
     </w:p>
     <w:p>
       <w:pPr>
@@ -3132,14 +3234,14 @@
       <w:pPr>
         <w:pStyle w:val="Heading1"/>
       </w:pPr>
-      <w:bookmarkStart w:id="26" w:name="_Toc007"/>
-      <w:bookmarkStart w:id="27" w:name="_Toc224899410"/>
+      <w:bookmarkStart w:id="38" w:name="_Toc007"/>
+      <w:bookmarkStart w:id="39" w:name="_Toc231064337"/>
       <w:r>
         <w:lastRenderedPageBreak/>
         <w:t>7. Заключение</w:t>
       </w:r>
-      <w:bookmarkEnd w:id="26"/>
-      <w:bookmarkEnd w:id="27"/>
+      <w:bookmarkEnd w:id="38"/>
+      <w:bookmarkEnd w:id="39"/>
     </w:p>
     <w:p>
       <w:r>
@@ -3154,7 +3256,24 @@
     </w:p>
     <w:p>
       <w:r>
-        <w:t>Модулният дизайн позволява заместване на Фаза 2 (логика на филтъра) с изисквания, специфични за домейна (напр</w:t>
+        <w:t>Рефакторирането в обектно-ориентирана архитектура отговаря на академичните изисквания за курсов проект по Програмиране на Python, като запазва пълната функционалност на оригиналното решение</w:t>
+      </w:r>
+      <w:r>
+        <w:t>, което бе създадено за корпоративно използване,</w:t>
+      </w:r>
+      <w:r>
+        <w:t xml:space="preserve"> и добавя предимства като инкапсулация, модулност и възможност за повторна употреба.</w:t>
+      </w:r>
+    </w:p>
+    <w:p>
+      <w:r>
+        <w:t xml:space="preserve">Модулният дизайн позволява заместване на </w:t>
+      </w:r>
+      <w:r>
+        <w:t>фазата за филтриране</w:t>
+      </w:r>
+      <w:r>
+        <w:t xml:space="preserve"> с изисквания, специфични за домейна (напр</w:t>
       </w:r>
       <w:r>
         <w:t>.</w:t>
@@ -3197,17 +3316,30 @@
       <w:r>
         <w:rPr>
           <w:b/>
-        </w:rPr>
-        <w:t>pst_extractor.py</w:t>
-      </w:r>
-      <w:r>
-        <w:t>: Модул за екстракция</w:t>
-      </w:r>
-      <w:r>
-        <w:t xml:space="preserve"> във</w:t>
-      </w:r>
-      <w:r>
-        <w:t xml:space="preserve"> Фаза 1</w:t>
+          <w:lang w:val="en-US"/>
+        </w:rPr>
+        <w:t>models</w:t>
+      </w:r>
+      <w:r>
+        <w:rPr>
+          <w:b/>
+        </w:rPr>
+        <w:t>.py</w:t>
+      </w:r>
+      <w:r>
+        <w:t>:</w:t>
+      </w:r>
+      <w:r>
+        <w:rPr>
+          <w:lang w:val="en-US"/>
+        </w:rPr>
+        <w:t xml:space="preserve"> </w:t>
+      </w:r>
+      <w:r>
+        <w:t>М</w:t>
+      </w:r>
+      <w:r>
+        <w:t>одул с класа EmailProcessor, съдържащ конструктор и методи за извличане, филтриране, сортиране и запис на данни</w:t>
       </w:r>
     </w:p>
     <w:p>
@@ -3220,29 +3352,30 @@
       <w:r>
         <w:rPr>
           <w:b/>
-        </w:rPr>
-        <w:t>filter_emails.py</w:t>
-      </w:r>
-      <w:r>
-        <w:t xml:space="preserve">: Модул за </w:t>
-      </w:r>
-      <w:r>
-        <w:t>санитизиране</w:t>
-      </w:r>
-      <w:r>
-        <w:t xml:space="preserve"> </w:t>
-      </w:r>
-      <w:r>
-        <w:t>във</w:t>
-      </w:r>
-      <w:r>
-        <w:t xml:space="preserve"> </w:t>
-      </w:r>
-      <w:r>
-        <w:t>Ф</w:t>
-      </w:r>
-      <w:r>
-        <w:t>аза 2</w:t>
+          <w:lang w:val="en-US"/>
+        </w:rPr>
+        <w:t>main</w:t>
+      </w:r>
+      <w:r>
+        <w:rPr>
+          <w:b/>
+        </w:rPr>
+        <w:t>.py</w:t>
+      </w:r>
+      <w:r>
+        <w:t xml:space="preserve">: </w:t>
+      </w:r>
+      <w:r>
+        <w:t>Г</w:t>
+      </w:r>
+      <w:r>
+        <w:t>лавен модул</w:t>
+      </w:r>
+      <w:r>
+        <w:t>,</w:t>
+      </w:r>
+      <w:r>
+        <w:t xml:space="preserve"> създава обект от класа и използва неговите методи за изпълнение на задачата</w:t>
       </w:r>
     </w:p>
     <w:p>
@@ -3255,23 +3388,19 @@
       <w:r>
         <w:rPr>
           <w:b/>
-        </w:rPr>
-        <w:t>Примерен addresses.csv</w:t>
-      </w:r>
-      <w:r>
-        <w:t xml:space="preserve">: </w:t>
-      </w:r>
-      <w:r>
-        <w:t xml:space="preserve">Примерен </w:t>
-      </w:r>
-      <w:r>
-        <w:t>изход</w:t>
-      </w:r>
-      <w:r>
-        <w:rPr>
-          <w:lang w:val="en-US"/>
-        </w:rPr>
-        <w:t>**</w:t>
+          <w:bCs/>
+        </w:rPr>
+        <w:t>requirements.txt</w:t>
+      </w:r>
+      <w:r>
+        <w:rPr>
+          <w:b/>
+          <w:bCs/>
+        </w:rPr>
+        <w:t>:</w:t>
+      </w:r>
+      <w:r>
+        <w:t xml:space="preserve"> файл със зависимости (в проекта се използва стандартната библиотека на Python)</w:t>
       </w:r>
     </w:p>
     <w:p>
@@ -3284,23 +3413,25 @@
       <w:r>
         <w:rPr>
           <w:b/>
-        </w:rPr>
-        <w:t>Примерен addresses_clean.csv</w:t>
-      </w:r>
-      <w:r>
-        <w:t xml:space="preserve">: </w:t>
-      </w:r>
-      <w:r>
-        <w:t>Примерен</w:t>
-      </w:r>
-      <w:r>
-        <w:t xml:space="preserve"> изход</w:t>
-      </w:r>
-      <w:r>
-        <w:rPr>
-          <w:lang w:val="en-US"/>
-        </w:rPr>
-        <w:t>**</w:t>
+          <w:bCs/>
+        </w:rPr>
+        <w:t>readme.txt</w:t>
+      </w:r>
+      <w:r>
+        <w:rPr>
+          <w:b/>
+          <w:bCs/>
+        </w:rPr>
+        <w:t>:</w:t>
+      </w:r>
+      <w:r>
+        <w:t xml:space="preserve"> </w:t>
+      </w:r>
+      <w:r>
+        <w:t>кратко ръководство за инсталация и употреба</w:t>
+      </w:r>
+      <w:r>
+        <w:t xml:space="preserve"> (почти идентично с текущата документация)</w:t>
       </w:r>
     </w:p>
     <w:p>
@@ -3324,157 +3455,16 @@
         <w:t>документация</w:t>
       </w:r>
       <w:r>
-        <w:t>: Обосновка на процеса (този документ)</w:t>
+        <w:t>: Обосновка на процеса (</w:t>
+      </w:r>
+      <w:r>
+        <w:t>текущият</w:t>
+      </w:r>
+      <w:r>
+        <w:t xml:space="preserve"> документ)</w:t>
       </w:r>
     </w:p>
     <w:p/>
-    <w:p>
-      <w:pPr>
-        <w:rPr>
-          <w:i/>
-          <w:iCs/>
-          <w:color w:val="747474" w:themeColor="background2" w:themeShade="80"/>
-          <w:lang w:val="en-US"/>
-        </w:rPr>
-      </w:pPr>
-      <w:r>
-        <w:rPr>
-          <w:i/>
-          <w:iCs/>
-          <w:color w:val="747474" w:themeColor="background2" w:themeShade="80"/>
-        </w:rPr>
-        <w:t xml:space="preserve">*За тестване е </w:t>
-      </w:r>
-      <w:r>
-        <w:rPr>
-          <w:i/>
-          <w:iCs/>
-          <w:color w:val="747474" w:themeColor="background2" w:themeShade="80"/>
-        </w:rPr>
-        <w:t>задължително</w:t>
-      </w:r>
-      <w:r>
-        <w:rPr>
-          <w:i/>
-          <w:iCs/>
-          <w:color w:val="747474" w:themeColor="background2" w:themeShade="80"/>
-        </w:rPr>
-        <w:t xml:space="preserve"> да съществува </w:t>
-      </w:r>
-      <w:r>
-        <w:rPr>
-          <w:i/>
-          <w:iCs/>
-          <w:color w:val="747474" w:themeColor="background2" w:themeShade="80"/>
-          <w:lang w:val="en-US"/>
-        </w:rPr>
-        <w:t>.</w:t>
-      </w:r>
-      <w:proofErr w:type="spellStart"/>
-      <w:r>
-        <w:rPr>
-          <w:i/>
-          <w:iCs/>
-          <w:color w:val="747474" w:themeColor="background2" w:themeShade="80"/>
-          <w:lang w:val="en-US"/>
-        </w:rPr>
-        <w:t>pst</w:t>
-      </w:r>
-      <w:proofErr w:type="spellEnd"/>
-      <w:r>
-        <w:rPr>
-          <w:i/>
-          <w:iCs/>
-          <w:color w:val="747474" w:themeColor="background2" w:themeShade="80"/>
-        </w:rPr>
-        <w:t xml:space="preserve"> файл в папката на проекта. По</w:t>
-      </w:r>
-      <w:r>
-        <w:rPr>
-          <w:i/>
-          <w:iCs/>
-          <w:color w:val="747474" w:themeColor="background2" w:themeShade="80"/>
-          <w:lang w:val="en-US"/>
-        </w:rPr>
-        <w:t xml:space="preserve"> GDPR </w:t>
-      </w:r>
-      <w:r>
-        <w:rPr>
-          <w:i/>
-          <w:iCs/>
-          <w:color w:val="747474" w:themeColor="background2" w:themeShade="80"/>
-        </w:rPr>
-        <w:t>такъв НЕ е предоставен, защото обикновено съдържа конфиденциална информация, по простата причина, че</w:t>
-      </w:r>
-      <w:r>
-        <w:rPr>
-          <w:i/>
-          <w:iCs/>
-          <w:color w:val="747474" w:themeColor="background2" w:themeShade="80"/>
-        </w:rPr>
-        <w:t xml:space="preserve"> това</w:t>
-      </w:r>
-      <w:r>
-        <w:rPr>
-          <w:i/>
-          <w:iCs/>
-          <w:color w:val="747474" w:themeColor="background2" w:themeShade="80"/>
-        </w:rPr>
-        <w:t xml:space="preserve"> е пълен експорт на една пощенска кутия в </w:t>
-      </w:r>
-      <w:r>
-        <w:rPr>
-          <w:i/>
-          <w:iCs/>
-          <w:color w:val="747474" w:themeColor="background2" w:themeShade="80"/>
-          <w:lang w:val="en-US"/>
-        </w:rPr>
-        <w:t>Outlook.</w:t>
-      </w:r>
-    </w:p>
-    <w:p>
-      <w:pPr>
-        <w:rPr>
-          <w:i/>
-          <w:iCs/>
-          <w:color w:val="747474" w:themeColor="background2" w:themeShade="80"/>
-        </w:rPr>
-      </w:pPr>
-      <w:r>
-        <w:rPr>
-          <w:i/>
-          <w:iCs/>
-          <w:color w:val="747474" w:themeColor="background2" w:themeShade="80"/>
-          <w:lang w:val="en-US"/>
-        </w:rPr>
-        <w:t>**</w:t>
-      </w:r>
-      <w:r>
-        <w:rPr>
-          <w:i/>
-          <w:iCs/>
-          <w:color w:val="747474" w:themeColor="background2" w:themeShade="80"/>
-        </w:rPr>
-        <w:t>Предоставените .</w:t>
-      </w:r>
-      <w:r>
-        <w:rPr>
-          <w:i/>
-          <w:iCs/>
-          <w:color w:val="747474" w:themeColor="background2" w:themeShade="80"/>
-          <w:lang w:val="en-US"/>
-        </w:rPr>
-        <w:t xml:space="preserve">CSV </w:t>
-      </w:r>
-      <w:r>
-        <w:rPr>
-          <w:i/>
-          <w:iCs/>
-          <w:color w:val="747474" w:themeColor="background2" w:themeShade="80"/>
-        </w:rPr>
-        <w:t>файлове трябва да бъдат ИЗТРИТИ или ПРЕМЕСТЕНИ от папката на проекта преди тестване, защото са само примерни такива.</w:t>
-      </w:r>
-    </w:p>
     <w:p>
       <w:pPr>
         <w:rPr>
@@ -3490,6 +3480,100 @@
           <w:cols w:space="708"/>
         </w:sectPr>
       </w:pPr>
+      <w:r>
+        <w:rPr>
+          <w:i/>
+          <w:iCs/>
+          <w:color w:val="747474" w:themeColor="background2" w:themeShade="80"/>
+        </w:rPr>
+        <w:t xml:space="preserve">*За тестване е </w:t>
+      </w:r>
+      <w:r>
+        <w:rPr>
+          <w:i/>
+          <w:iCs/>
+          <w:color w:val="747474" w:themeColor="background2" w:themeShade="80"/>
+        </w:rPr>
+        <w:t>задължително</w:t>
+      </w:r>
+      <w:r>
+        <w:rPr>
+          <w:i/>
+          <w:iCs/>
+          <w:color w:val="747474" w:themeColor="background2" w:themeShade="80"/>
+        </w:rPr>
+        <w:t xml:space="preserve"> да съществува </w:t>
+      </w:r>
+      <w:r>
+        <w:rPr>
+          <w:i/>
+          <w:iCs/>
+          <w:color w:val="747474" w:themeColor="background2" w:themeShade="80"/>
+          <w:lang w:val="en-US"/>
+        </w:rPr>
+        <w:t>.</w:t>
+      </w:r>
+      <w:proofErr w:type="spellStart"/>
+      <w:r>
+        <w:rPr>
+          <w:i/>
+          <w:iCs/>
+          <w:color w:val="747474" w:themeColor="background2" w:themeShade="80"/>
+          <w:lang w:val="en-US"/>
+        </w:rPr>
+        <w:t>pst</w:t>
+      </w:r>
+      <w:proofErr w:type="spellEnd"/>
+      <w:r>
+        <w:rPr>
+          <w:i/>
+          <w:iCs/>
+          <w:color w:val="747474" w:themeColor="background2" w:themeShade="80"/>
+        </w:rPr>
+        <w:t xml:space="preserve"> файл в папката на проекта. По</w:t>
+      </w:r>
+      <w:r>
+        <w:rPr>
+          <w:i/>
+          <w:iCs/>
+          <w:color w:val="747474" w:themeColor="background2" w:themeShade="80"/>
+          <w:lang w:val="en-US"/>
+        </w:rPr>
+        <w:t xml:space="preserve"> GDPR </w:t>
+      </w:r>
+      <w:r>
+        <w:rPr>
+          <w:i/>
+          <w:iCs/>
+          <w:color w:val="747474" w:themeColor="background2" w:themeShade="80"/>
+        </w:rPr>
+        <w:t>такъв НЕ е предоставен, защото обикновено съдържа конфиденциална информация, по простата причина, че</w:t>
+      </w:r>
+      <w:r>
+        <w:rPr>
+          <w:i/>
+          <w:iCs/>
+          <w:color w:val="747474" w:themeColor="background2" w:themeShade="80"/>
+        </w:rPr>
+        <w:t xml:space="preserve"> това</w:t>
+      </w:r>
+      <w:r>
+        <w:rPr>
+          <w:i/>
+          <w:iCs/>
+          <w:color w:val="747474" w:themeColor="background2" w:themeShade="80"/>
+        </w:rPr>
+        <w:t xml:space="preserve"> е пълен експорт на една пощенска кутия в </w:t>
+      </w:r>
+      <w:r>
+        <w:rPr>
+          <w:i/>
+          <w:iCs/>
+          <w:color w:val="747474" w:themeColor="background2" w:themeShade="80"/>
+          <w:lang w:val="en-US"/>
+        </w:rPr>
+        <w:t>Outlook.</w:t>
+      </w:r>
     </w:p>
     <w:p>
       <w:r>
@@ -4741,7 +4825,6 @@
   <w:style w:type="character" w:default="1" w:styleId="DefaultParagraphFont">
     <w:name w:val="Default Paragraph Font"/>
     <w:uiPriority w:val="1"/>
-    <w:semiHidden/>
     <w:unhideWhenUsed/>
   </w:style>
   <w:style w:type="table" w:default="1" w:styleId="TableNormal">

</xml_diff>